<commit_message>
Ajusta projeto de pesquisa para Sítio Novo/MA e adiciona termo de anuência
Co-Authored-By: Claude Sonnet 5.5 <noreply@anthropic.com>
</commit_message>
<xml_diff>
--- a/Orientação – Projeto de Pesquisa/Projeto de Pesquisa - Paulo Ricardo.docx
+++ b/Orientação – Projeto de Pesquisa/Projeto de Pesquisa - Paulo Ricardo.docx
@@ -1801,7 +1801,7 @@
           <w:sz w:val="24"/>
           <w:szCs w:val="24"/>
         </w:rPr>
-        <w:t xml:space="preserve"> prédio público municipal de Grajaú/MA, com foco no bloqueio de quatro categorias de conteúdo: (i) sexual/pornográfico; (ii) apostas </w:t>
+        <w:t xml:space="preserve"> prédio público municipal de Sítio Novo/MA, com foco no bloqueio de quatro categorias de conteúdo: (i) sexual/pornográfico; (ii) apostas </w:t>
       </w:r>
       <w:r>
         <w:rPr>
@@ -2294,7 +2294,7 @@
           <w:sz w:val="24"/>
           <w:szCs w:val="24"/>
         </w:rPr>
-        <w:t xml:space="preserve">Avaliar a eficácia do Pi-hole, implantado em servidor local, como ferramenta de segurança e de controle de acesso a conteúdos indevidos na rede de um prédio público municipal de Grajaú/MA.</w:t>
+        <w:t xml:space="preserve">Avaliar a eficácia do Pi-hole, implantado em servidor local, como ferramenta de segurança e de controle de acesso a conteúdos indevidos na rede de um prédio público municipal de Sítio Novo/MA.</w:t>
       </w:r>
     </w:p>
     <w:p>
@@ -3588,58 +3588,61 @@
           <w:sz w:val="24"/>
           <w:szCs w:val="24"/>
         </w:rPr>
-        <w:t xml:space="preserve">O estudo será realizado no </w:t>
-      </w:r>
-      <w:r>
-        <w:rPr>
-          <w:rFonts w:ascii="Arial" w:cs="Arial" w:eastAsia="Arial" w:hAnsi="Arial"/>
-          <w:sz w:val="24"/>
-          <w:szCs w:val="24"/>
-          <w:highlight w:val="yellow"/>
-        </w:rPr>
-        <w:t xml:space="preserve">[nome do prédio/órgão, por exemplo, prédio-sede da Prefeitura Municipal ou da Secretaria Municipal de ...]</w:t>
-      </w:r>
-      <w:r>
-        <w:rPr>
-          <w:rFonts w:ascii="Arial" w:cs="Arial" w:eastAsia="Arial" w:hAnsi="Arial"/>
-          <w:sz w:val="24"/>
-          <w:szCs w:val="24"/>
-        </w:rPr>
-        <w:t xml:space="preserve"> de Grajaú/MA, que conta com aproximadamente </w:t>
-      </w:r>
-      <w:r>
-        <w:rPr>
-          <w:rFonts w:ascii="Arial" w:cs="Arial" w:eastAsia="Arial" w:hAnsi="Arial"/>
-          <w:sz w:val="24"/>
-          <w:szCs w:val="24"/>
-          <w:highlight w:val="yellow"/>
-        </w:rPr>
-        <w:t xml:space="preserve">[número]</w:t>
-      </w:r>
-      <w:r>
-        <w:rPr>
-          <w:rFonts w:ascii="Arial" w:cs="Arial" w:eastAsia="Arial" w:hAnsi="Arial"/>
-          <w:sz w:val="24"/>
-          <w:szCs w:val="24"/>
-        </w:rPr>
-        <w:t xml:space="preserve"> estações de trabalho e </w:t>
-      </w:r>
-      <w:r>
-        <w:rPr>
-          <w:rFonts w:ascii="Arial" w:cs="Arial" w:eastAsia="Arial" w:hAnsi="Arial"/>
-          <w:sz w:val="24"/>
-          <w:szCs w:val="24"/>
-          <w:highlight w:val="yellow"/>
-        </w:rPr>
-        <w:t xml:space="preserve">[descrever brevemente: rede cabeada, rede sem fio, roteador ou firewall utilizado]</w:t>
-      </w:r>
-      <w:r>
-        <w:rPr>
-          <w:rFonts w:ascii="Arial" w:cs="Arial" w:eastAsia="Arial" w:hAnsi="Arial"/>
-          <w:sz w:val="24"/>
-          <w:szCs w:val="24"/>
-        </w:rPr>
-        <w:t xml:space="preserve">. O objeto de estudo é o serviço de resolução de nomes (DNS) da rede local e o comportamento do Pi-hole como filtro desse serviço. Os participantes diretos serão o(s) responsável(is) técnico(s) pela rede, que responderão à entrevista de diagnóstico. Os demais servidores não serão sujeitos individuais da pesquisa: apenas estatísticas agregadas e anonimizadas do tráfego DNS serão analisadas, caso o piloto seja autorizado.</w:t>
+        <w:t xml:space="preserve">O estudo será realizado no prédio-sede da Secretaria Municipal de Educação de Sítio Novo/MA, situado na Avenida Leonardo de Almeida, s/nº, Centro, que conta com aproximadamente 14 estações de trabalho, conectadas em sua maior parte por rede cabeada com cabeamento de categoria 5e, além de rede sem fio (</w:t>
+      </w:r>
+      <w:r>
+        <w:rPr>
+          <w:rFonts w:ascii="Arial" w:cs="Arial" w:eastAsia="Arial" w:hAnsi="Arial"/>
+          <w:i/>
+          <w:iCs/>
+          <w:sz w:val="24"/>
+          <w:szCs w:val="24"/>
+        </w:rPr>
+        <w:t xml:space="preserve">Wi-Fi</w:t>
+      </w:r>
+      <w:r>
+        <w:rPr>
+          <w:rFonts w:ascii="Arial" w:cs="Arial" w:eastAsia="Arial" w:hAnsi="Arial"/>
+          <w:sz w:val="24"/>
+          <w:szCs w:val="24"/>
+        </w:rPr>
+        <w:t xml:space="preserve">), sendo a distribuição de endereços (DHCP) e o acesso à internet realizados por um roteador TP-Link Aginet EX511 (</w:t>
+      </w:r>
+      <w:r>
+        <w:rPr>
+          <w:rFonts w:ascii="Arial" w:cs="Arial" w:eastAsia="Arial" w:hAnsi="Arial"/>
+          <w:i/>
+          <w:iCs/>
+          <w:sz w:val="24"/>
+          <w:szCs w:val="24"/>
+        </w:rPr>
+        <w:t xml:space="preserve">Wi-Fi</w:t>
+      </w:r>
+      <w:r>
+        <w:rPr>
+          <w:rFonts w:ascii="Arial" w:cs="Arial" w:eastAsia="Arial" w:hAnsi="Arial"/>
+          <w:sz w:val="24"/>
+          <w:szCs w:val="24"/>
+        </w:rPr>
+        <w:t xml:space="preserve"> 6, </w:t>
+      </w:r>
+      <w:r>
+        <w:rPr>
+          <w:rFonts w:ascii="Arial" w:cs="Arial" w:eastAsia="Arial" w:hAnsi="Arial"/>
+          <w:i/>
+          <w:iCs/>
+          <w:sz w:val="24"/>
+          <w:szCs w:val="24"/>
+        </w:rPr>
+        <w:t xml:space="preserve">Dual-Band</w:t>
+      </w:r>
+      <w:r>
+        <w:rPr>
+          <w:rFonts w:ascii="Arial" w:cs="Arial" w:eastAsia="Arial" w:hAnsi="Arial"/>
+          <w:sz w:val="24"/>
+          <w:szCs w:val="24"/>
+        </w:rPr>
+        <w:t xml:space="preserve"> AX3000). O objeto de estudo é o serviço de resolução de nomes (DNS) da rede local e o comportamento do Pi-hole como filtro desse serviço. Os participantes diretos serão o(s) responsável(is) técnico(s) pela rede, que responderão à entrevista de diagnóstico. Os demais servidores não serão sujeitos individuais da pesquisa: apenas estatísticas agregadas e anonimizadas do tráfego DNS serão analisadas, caso o piloto seja autorizado.</w:t>
       </w:r>
     </w:p>
     <w:p>

</xml_diff>

<commit_message>
Incorpora crítica: normas vigentes, novas referências, lista local do setor e segundo autor
Co-Authored-By: Claude Sonnet 5.5 <noreply@anthropic.com>
</commit_message>
<xml_diff>
--- a/Orientação – Projeto de Pesquisa/Projeto de Pesquisa - Paulo Ricardo.docx
+++ b/Orientação – Projeto de Pesquisa/Projeto de Pesquisa - Paulo Ricardo.docx
@@ -71,6 +71,22 @@
     </w:p>
     <w:p>
       <w:pPr>
+        <w:spacing w:line="360"/>
+        <w:jc w:val="center"/>
+      </w:pPr>
+      <w:r>
+        <w:rPr>
+          <w:rFonts w:ascii="Arial" w:cs="Arial" w:eastAsia="Arial" w:hAnsi="Arial"/>
+          <w:b/>
+          <w:bCs/>
+          <w:sz w:val="24"/>
+          <w:szCs w:val="24"/>
+        </w:rPr>
+        <w:t xml:space="preserve">KAIRO BRENDO RODRIGUES MARINHO LOPES SILVA</w:t>
+      </w:r>
+    </w:p>
+    <w:p>
+      <w:pPr>
         <w:spacing w:before="2600" w:line="360"/>
         <w:jc w:val="center"/>
       </w:pPr>
@@ -143,6 +159,22 @@
           <w:szCs w:val="24"/>
         </w:rPr>
         <w:t xml:space="preserve">PAULO RICARDO COIMBRA SOUSA</w:t>
+      </w:r>
+    </w:p>
+    <w:p>
+      <w:pPr>
+        <w:spacing w:line="360"/>
+        <w:jc w:val="center"/>
+      </w:pPr>
+      <w:r>
+        <w:rPr>
+          <w:rFonts w:ascii="Arial" w:cs="Arial" w:eastAsia="Arial" w:hAnsi="Arial"/>
+          <w:b/>
+          <w:bCs/>
+          <w:sz w:val="24"/>
+          <w:szCs w:val="24"/>
+        </w:rPr>
+        <w:t xml:space="preserve">KAIRO BRENDO RODRIGUES MARINHO LOPES SILVA</w:t>
       </w:r>
     </w:p>
     <w:p>
@@ -862,7 +894,7 @@
           <w:sz w:val="24"/>
           <w:szCs w:val="24"/>
         </w:rPr>
-        <w:t xml:space="preserve">	10</w:t>
+        <w:t xml:space="preserve">	11</w:t>
       </w:r>
     </w:p>
     <w:p>
@@ -912,7 +944,7 @@
           <w:sz w:val="24"/>
           <w:szCs w:val="24"/>
         </w:rPr>
-        <w:t xml:space="preserve">	11</w:t>
+        <w:t xml:space="preserve">	12</w:t>
       </w:r>
     </w:p>
     <w:p>
@@ -1212,7 +1244,7 @@
           <w:sz w:val="24"/>
           <w:szCs w:val="24"/>
         </w:rPr>
-        <w:t xml:space="preserve">	16</w:t>
+        <w:t xml:space="preserve">	17</w:t>
       </w:r>
     </w:p>
     <w:p>
@@ -1262,7 +1294,7 @@
           <w:sz w:val="24"/>
           <w:szCs w:val="24"/>
         </w:rPr>
-        <w:t xml:space="preserve">	18</w:t>
+        <w:t xml:space="preserve">	19</w:t>
       </w:r>
     </w:p>
     <w:p>
@@ -1312,7 +1344,7 @@
           <w:sz w:val="24"/>
           <w:szCs w:val="24"/>
         </w:rPr>
-        <w:t xml:space="preserve">	18</w:t>
+        <w:t xml:space="preserve">	19</w:t>
       </w:r>
     </w:p>
     <w:p>
@@ -1362,7 +1394,7 @@
           <w:sz w:val="24"/>
           <w:szCs w:val="24"/>
         </w:rPr>
-        <w:t xml:space="preserve">	19</w:t>
+        <w:t xml:space="preserve">	20</w:t>
       </w:r>
     </w:p>
     <w:p>
@@ -1412,7 +1444,7 @@
           <w:sz w:val="24"/>
           <w:szCs w:val="24"/>
         </w:rPr>
-        <w:t xml:space="preserve">	20</w:t>
+        <w:t xml:space="preserve">	21</w:t>
       </w:r>
     </w:p>
     <w:p>
@@ -1462,7 +1494,7 @@
           <w:sz w:val="24"/>
           <w:szCs w:val="24"/>
         </w:rPr>
-        <w:t xml:space="preserve">	24</w:t>
+        <w:t xml:space="preserve">	25</w:t>
       </w:r>
     </w:p>
     <w:p>
@@ -1518,7 +1550,7 @@
           <w:sz w:val="24"/>
           <w:szCs w:val="24"/>
         </w:rPr>
-        <w:t xml:space="preserve">	25</w:t>
+        <w:t xml:space="preserve">	26</w:t>
       </w:r>
     </w:p>
     <w:p>
@@ -1561,7 +1593,7 @@
           <w:sz w:val="24"/>
           <w:szCs w:val="24"/>
         </w:rPr>
-        <w:t xml:space="preserve">A informatização dos serviços públicos municipais avançou de forma expressiva na última década. Segundo a pesquisa TIC Governo Eletrônico 2023, que ouviu 4.265 prefeituras, 91% delas já disponibilizavam ao menos um serviço digital ao cidadão, contra 75% dez anos antes (CENTRO REGIONAL DE ESTUDOS PARA O DESENVOLVIMENTO DA SOCIEDADE DA INFORMAÇÃO, 2024). Essa expansão, porém, não foi acompanhada na mesma proporção pela estruturação da segurança da informação: a mesma pesquisa aponta que apenas 33% das prefeituras contavam com centro de operações para monitoramento de tráfego, segurança e emergências, índice que chega a 84% somente nos municípios com mais de 500 mil habitantes (CENTRO REGIONAL DE ESTUDOS PARA O DESENVOLVIMENTO DA SOCIEDADE DA INFORMAÇÃO, 2024). Em outras palavras, a maior parte dos municípios brasileiros, especialmente os de pequeno e médio porte, como grande parte dos maranhenses, opera redes conectadas à internet com pouca ou nenhuma camada de proteção e de controle.</w:t>
+        <w:t xml:space="preserve">A informatização dos serviços públicos municipais avançou de forma expressiva na última década. Segundo a pesquisa TIC Governo Eletrônico 2023, que ouviu 4.265 prefeituras, 91% delas já disponibilizavam ao menos um serviço digital ao cidadão, contra 75% dez anos antes (CENTRO REGIONAL DE ESTUDOS PARA O DESENVOLVIMENTO DA SOCIEDADE DA INFORMAÇÃO, 2024). Essa expansão amplia a superfície de exposição das redes municipais: quanto mais os serviços e os usuários dependem da conexão, maior o impacto de acessos indevidos e de ataques, e os incidentes contra órgãos públicos têm crescido (ARRUDA, 2025). A pesquisa do Cetic.br, contudo, não mede a segurança cibernética das prefeituras; por isso, a ausência de controles de navegação em redes de municípios de pequeno porte é tratada aqui como problema observado pelos pesquisadores, e não como dado estatístico.</w:t>
       </w:r>
     </w:p>
     <w:p>
@@ -2017,7 +2049,7 @@
           <w:sz w:val="24"/>
           <w:szCs w:val="24"/>
         </w:rPr>
-        <w:t xml:space="preserve">A relevância institucional decorre do alinhamento com as políticas públicas de segurança da informação. A Política Nacional de Segurança da Informação (BRASIL, 2018a) e a Política Nacional de Cibersegurança (BRASIL, 2023) estabelecem diretrizes para a proteção dos ativos de informação na administração pública, e o Programa de Privacidade e Segurança da Informação (PPSI), da Secretaria de Governo Digital, organiza seus controles com base no CIS Controls, incluindo o controle dedicado às proteções de </w:t>
+        <w:t xml:space="preserve">A relevância institucional decorre do alinhamento com as políticas públicas de segurança da informação. A Política Nacional de Segurança da Informação (BRASIL, 2025a), a Política Nacional de Cibersegurança (BRASIL, 2023) e a Estratégia Nacional de Cibersegurança (BRASIL, 2025b) estabelecem diretrizes para a proteção dos ativos de informação na administração pública, e o Programa de Privacidade e Segurança da Informação (PPSI), da Secretaria de Governo Digital, organiza seus controles com base no CIS Controls, incluindo o controle dedicado às proteções de </w:t>
       </w:r>
       <w:r>
         <w:rPr>
@@ -2086,7 +2118,7 @@
           <w:sz w:val="24"/>
           <w:szCs w:val="24"/>
         </w:rPr>
-        <w:t xml:space="preserve">, 2026), porém não foram localizados, no levantamento preliminar, estudos voltados especificamente à administração pública municipal brasileira, com suas particularidades legais, como a necessidade de conciliar o controle de acesso com a Lei Geral de Proteção de Dados Pessoais (BRASIL, 2018b).</w:t>
+        <w:t xml:space="preserve">, 2026), porém não foram localizados, no levantamento preliminar, estudos voltados especificamente à administração pública municipal brasileira, com suas particularidades legais, como a necessidade de conciliar o controle de acesso com a Lei Geral de Proteção de Dados Pessoais (BRASIL, 2018).</w:t>
       </w:r>
     </w:p>
     <w:p>
@@ -2568,7 +2600,7 @@
           <w:sz w:val="24"/>
           <w:szCs w:val="24"/>
         </w:rPr>
-        <w:t xml:space="preserve">No Brasil, a Política Nacional de Segurança da Informação (BRASIL, 2018a) e a Política Nacional de Cibersegurança (BRASIL, 2023) definem princípios e objetivos para a proteção dos ativos de informação do Estado. Para operacionalizá-los, a Secretaria de Governo Digital criou o PPSI, cujo guia de </w:t>
+        <w:t xml:space="preserve">No Brasil, a Política Nacional de Segurança da Informação (BRASIL, 2025a), a Política Nacional de Cibersegurança (BRASIL, 2023) e a Estratégia Nacional de Cibersegurança (BRASIL, 2025b) definem princípios e objetivos para a proteção dos ativos de informação do Estado. Para operacionalizá-los, a Secretaria de Governo Digital criou o PPSI, cujo guia de </w:t>
       </w:r>
       <w:r>
         <w:rPr>
@@ -2622,7 +2654,7 @@
           <w:sz w:val="24"/>
           <w:szCs w:val="24"/>
         </w:rPr>
-        <w:t xml:space="preserve"> (BRASIL, 2024). Há, contudo, uma lacuna entre esse arcabouço, pensado para órgãos federais com equipes estruturadas, e a realidade municipal. Os dados da pesquisa TIC Governo Eletrônico, que revelam baixa presença de centros de monitoramento nas prefeituras menores (CENTRO REGIONAL DE ESTUDOS PARA O DESENVOLVIMENTO DA SOCIEDADE DA INFORMAÇÃO, 2024), e o aumento dos incidentes contra órgãos públicos (ARRUDA, 2025) reforçam a necessidade de soluções simples, de baixo custo e documentadas, que traduzam essas diretrizes para a escala de um prédio municipal. É nesse espaço que se insere a presente proposta.</w:t>
+        <w:t xml:space="preserve"> (BRASIL, 2024). Há, contudo, uma lacuna entre esse arcabouço, pensado para órgãos federais com equipes estruturadas, e a realidade municipal. O aumento dos incidentes contra órgãos públicos (ARRUDA, 2025) reforça a necessidade de soluções simples, de baixo custo e documentadas, que traduzam essas diretrizes para a escala de um prédio municipal. É nesse espaço que se insere a presente proposta.</w:t>
       </w:r>
     </w:p>
     <w:p>
@@ -2683,7 +2715,7 @@
           <w:sz w:val="24"/>
           <w:szCs w:val="24"/>
         </w:rPr>
-        <w:t xml:space="preserve"> para acelerar consultas futuras.</w:t>
+        <w:t xml:space="preserve"> para acelerar consultas futuras. A terminologia adotada neste trabalho segue a consolidação mais recente publicada pelo IETF (HOFFMAN; FUJIWARA, 2024).</w:t>
       </w:r>
     </w:p>
     <w:p>
@@ -2912,7 +2944,7 @@
           <w:sz w:val="24"/>
           <w:szCs w:val="24"/>
         </w:rPr>
-        <w:t xml:space="preserve">A eficácia desse modelo, porém, depende diretamente da qualidade das listas utilizadas. Kührer, Rossow e Holz (2014), ao avaliarem listas públicas de domínios maliciosos, constataram que elas apresentam coberturas muito distintas, que nenhuma lista isolada é suficiente e que a atualização frequente é decisiva, pois domínios maliciosos têm vida curta. Para a filtragem de categorias de conteúdo, como sítios adultos e de apostas, existem listas mantidas por comunidades e instituições, como o repositório </w:t>
+        <w:t xml:space="preserve">O CIS Controls v8.1 distingue a filtragem de DNS (salvaguarda 9.2), que bloqueia domínios maliciosos conhecidos, dos filtros de URL em nível de rede (salvaguarda 9.3), distinção que delimita o que o Pi-hole resolve e o que exigiria controles adicionais (CENTER FOR INTERNET SECURITY, 2024). A eficácia desse modelo, porém, depende diretamente da qualidade das listas utilizadas. Kührer, Rossow e Holz (2014), ao avaliarem listas públicas de domínios maliciosos, constataram que elas apresentam coberturas muito distintas, que nenhuma lista isolada é suficiente e que a atualização frequente é decisiva, pois domínios maliciosos têm vida curta. Para a filtragem de categorias de conteúdo, como sítios adultos e de apostas, existem listas mantidas por comunidades e instituições, como o repositório </w:t>
       </w:r>
       <w:r>
         <w:rPr>
@@ -3132,7 +3164,7 @@
           <w:sz w:val="24"/>
           <w:szCs w:val="24"/>
         </w:rPr>
-        <w:t xml:space="preserve">Entre as funcionalidades relevantes para o contexto desta pesquisa, destacam-se: o gerenciamento de grupos, que permite associar clientes, identificados por endereço IP, MAC ou sub-rede, a conjuntos distintos de listas e regras; o bloqueio por expressões regulares; as listas de permissão, úteis para garantir o funcionamento de sistemas governamentais; o painel de estatísticas e o registro de consultas; e os níveis de privacidade, que permitem ocultar domínios e clientes nos registros (PI-HOLE, 2025a). Este último recurso é particularmente importante na administração pública, pois possibilita equilibrar a necessidade de auditoria com os princípios de necessidade e de minimização de dados previstos na LGPD (BRASIL, 2018b). O Pi-hole pode, ainda, trabalhar em conjunto com o Unbound, um resolvedor recursivo com validação DNSSEC, que permite à rede resolver nomes diretamente a partir dos servidores raiz, sem depender de provedores externos de DNS (NLNET LABS, 2025).</w:t>
+        <w:t xml:space="preserve">Entre as funcionalidades relevantes para o contexto desta pesquisa, destacam-se: o gerenciamento de grupos, que permite associar clientes, identificados por endereço IP, MAC ou sub-rede, a conjuntos distintos de listas e regras; o bloqueio por expressões regulares; as listas de permissão, úteis para garantir o funcionamento de sistemas governamentais; o painel de estatísticas e o registro de consultas; e os níveis de privacidade, que permitem ocultar domínios e clientes nos registros (PI-HOLE, 2025a). Este último recurso é particularmente importante na administração pública, pois possibilita equilibrar a necessidade de auditoria com os princípios de necessidade e de minimização de dados previstos na LGPD (BRASIL, 2018). O Pi-hole pode, ainda, trabalhar em conjunto com o Unbound, um resolvedor recursivo com validação DNSSEC, que permite à rede resolver nomes diretamente a partir dos servidores raiz, sem depender de provedores externos de DNS (NLNET LABS, 2025).</w:t>
       </w:r>
     </w:p>
     <w:p>
@@ -3298,7 +3330,7 @@
           <w:sz w:val="24"/>
           <w:szCs w:val="24"/>
         </w:rPr>
-        <w:t xml:space="preserve"> (2020) mostram que esses protocolos já estão integrados aos principais navegadores, e a CISA alerta que recursos de DNS cifrado ativados por padrão em aplicativos e sistemas operacionais podem desviar as consultas dos controles de DNS da organização (CYBERSECURITY AND INFRASTRUCTURE SECURITY AGENCY, 2024).</w:t>
+        <w:t xml:space="preserve"> (2020) mostram que esses protocolos já estão integrados aos principais navegadores, e a CISA alerta que recursos de DNS cifrado ativados por padrão em aplicativos e sistemas operacionais podem desviar as consultas dos controles de DNS da organização (CYBERSECURITY AND INFRASTRUCTURE SECURITY AGENCY, 2024). O DNS sobre QUIC (DoQ), padronizado em 2022, oferece confidencialidade comparável à do DoT sobre outro transporte (HUITEMA; DICKINSON; MANKIN, 2022); por restrição de escopo, os testes de contorno se limitarão a DNS externo configurado manualmente, DoT e DoH, e o DoQ será registrado como limitação.</w:t>
       </w:r>
     </w:p>
     <w:p>
@@ -3392,7 +3424,7 @@
           <w:sz w:val="24"/>
           <w:szCs w:val="24"/>
         </w:rPr>
-        <w:t xml:space="preserve">O controle da navegação em uma rede pública envolve, inevitavelmente, o tratamento de dados. O Marco Civil da Internet estabelece princípios como a proteção da privacidade e dos dados pessoais no uso da internet (BRASIL, 2014), e a LGPD determina que o tratamento de dados pelo poder público deve atender à sua finalidade pública e observar os princípios da finalidade, da necessidade e da transparência (BRASIL, 2018b). Os registros de consultas DNS, ao associarem um endereço IP a um domínio acessado, podem configurar dados pessoais quando permitirem identificar o servidor que os gerou. Por isso, a proposta deve definir com clareza a finalidade dos registros, o período de retenção e quem terá acesso a eles, e comunicar a existência do filtro aos usuários por meio de uma política de uso aceitável.</w:t>
+        <w:t xml:space="preserve">O controle da navegação em uma rede pública envolve, inevitavelmente, o tratamento de dados. O Marco Civil da Internet estabelece princípios como a proteção da privacidade e dos dados pessoais no uso da internet (BRASIL, 2014), e a LGPD determina que o tratamento de dados pelo poder público deve atender à sua finalidade pública e observar os princípios da finalidade, da necessidade e da transparência (BRASIL, 2018). Os registros de consultas DNS, ao associarem um endereço IP a um domínio acessado, podem configurar dados pessoais quando permitirem identificar o servidor que os gerou. Por isso, a proposta deve definir com clareza a finalidade dos registros, o período de retenção e quem terá acesso a eles, e comunicar a existência do filtro aos usuários por meio de uma política de uso aceitável. O guia orientativo da ANPD sobre o tratamento de dados pessoais pelo poder público detalha a aplicação das bases legais e dos princípios da LGPD a órgãos públicos (AUTORIDADE NACIONAL DE PROTEÇÃO DE DADOS, 2023a), e o guia sobre fins acadêmicos orienta o tratamento de dados em estudos e pesquisas (AUTORIDADE NACIONAL DE PROTEÇÃO DE DADOS, 2023b).</w:t>
       </w:r>
     </w:p>
     <w:p>
@@ -3545,7 +3577,25 @@
           <w:sz w:val="24"/>
           <w:szCs w:val="24"/>
         </w:rPr>
-        <w:t xml:space="preserve">, 2004). Dresch, Lacerda e Antunes Júnior (2015) organizam a DSR em etapas de identificação do problema, conscientização, proposição, projeto e desenvolvimento do artefato, avaliação, explicitação das aprendizagens e comunicação dos resultados. Neste projeto, o artefato é o modelo de implantação do Pi-hole, composto pela configuração do servidor, pelas listas e grupos, pelas regras complementares de rede e pela documentação de replicação.</w:t>
+        <w:t xml:space="preserve">, 2004). Peffers </w:t>
+      </w:r>
+      <w:r>
+        <w:rPr>
+          <w:rFonts w:ascii="Arial" w:cs="Arial" w:eastAsia="Arial" w:hAnsi="Arial"/>
+          <w:i/>
+          <w:iCs/>
+          <w:sz w:val="24"/>
+          <w:szCs w:val="24"/>
+        </w:rPr>
+        <w:t xml:space="preserve">et al.</w:t>
+      </w:r>
+      <w:r>
+        <w:rPr>
+          <w:rFonts w:ascii="Arial" w:cs="Arial" w:eastAsia="Arial" w:hAnsi="Arial"/>
+          <w:sz w:val="24"/>
+          <w:szCs w:val="24"/>
+        </w:rPr>
+        <w:t xml:space="preserve"> (2007) propõem processo em seis atividades (identificação do problema e motivação, definição dos objetivos da solução, projeto e desenvolvimento, demonstração, avaliação e comunicação), que orienta a sequência das etapas do Quadro 1. Dresch, Lacerda e Antunes Júnior (2015) organizam a DSR em etapas de identificação do problema, conscientização, proposição, projeto e desenvolvimento do artefato, avaliação, explicitação das aprendizagens e comunicação dos resultados. Neste projeto, o artefato é o modelo de implantação do Pi-hole, composto pela configuração do servidor, pelas listas e grupos, pelas regras complementares de rede e pela documentação de replicação.</w:t>
       </w:r>
     </w:p>
     <w:p>
@@ -3657,7 +3707,7 @@
           <w:sz w:val="24"/>
           <w:szCs w:val="24"/>
         </w:rPr>
-        <w:t xml:space="preserve">A fim de garantir a exequibilidade no prazo disponível, os testes de eficácia e desempenho serão realizados em ambiente de homologação montado com equipamentos do próprio órgão ou do pesquisador, reproduzindo a configuração da rede diagnosticada. A implantação em produção, em um único setor e por período limitado, será realizada somente mediante autorização formal da instituição.</w:t>
+        <w:t xml:space="preserve">A fim de garantir a exequibilidade no prazo disponível, os testes de eficácia e desempenho serão realizados em ambiente de homologação montado com equipamentos do próprio órgão ou dos pesquisadores, reproduzindo a configuração da rede diagnosticada. A implantação em produção, em um único setor e por período limitado, será realizada somente mediante autorização formal da instituição.</w:t>
       </w:r>
     </w:p>
     <w:p>
@@ -4778,7 +4828,7 @@
           <w:sz w:val="20"/>
           <w:szCs w:val="20"/>
         </w:rPr>
-        <w:t xml:space="preserve">Fonte: Elaborado pelo autor (2026).</w:t>
+        <w:t xml:space="preserve">Fonte: Elaborado pelos autores (2026).</w:t>
       </w:r>
     </w:p>
     <w:p>
@@ -4793,7 +4843,40 @@
           <w:sz w:val="24"/>
           <w:szCs w:val="24"/>
         </w:rPr>
-        <w:t xml:space="preserve">Na etapa 3, o servidor local receberá um sistema operacional Linux de suporte estendido (Debian 12 ou Ubuntu Server 24.04 LTS), endereço IP fixo e a versão estável mais recente do Pi-hole. Serão configuradas listas de bloqueio por categoria, a partir das fontes discutidas na seção 3.3, uma lista de permissão com domínios de sistemas utilizados pelo órgão e, ao menos, dois grupos de clientes com políticas distintas. No roteador ou </w:t>
+        <w:t xml:space="preserve">A avaliação do artefato segue o </w:t>
+      </w:r>
+      <w:r>
+        <w:rPr>
+          <w:rFonts w:ascii="Arial" w:cs="Arial" w:eastAsia="Arial" w:hAnsi="Arial"/>
+          <w:i/>
+          <w:iCs/>
+          <w:sz w:val="24"/>
+          <w:szCs w:val="24"/>
+        </w:rPr>
+        <w:t xml:space="preserve">framework</w:t>
+      </w:r>
+      <w:r>
+        <w:rPr>
+          <w:rFonts w:ascii="Arial" w:cs="Arial" w:eastAsia="Arial" w:hAnsi="Arial"/>
+          <w:sz w:val="24"/>
+          <w:szCs w:val="24"/>
+        </w:rPr>
+        <w:t xml:space="preserve"> FEDS, de Venable, Pries-Heje e Baskerville (2016), que classifica as avaliações quanto ao propósito (formativa ou somativa) e ao paradigma (artificial ou naturalista). Os testes em ambiente de homologação constituem avaliação artificial e formativa, que permite corrigir o artefato; o piloto, quando autorizado, constitui avaliação naturalista e somativa. Caso o piloto não seja autorizado, a conclusão se apoiará na avaliação em homologação, e as limitações decorrentes serão registradas.</w:t>
+      </w:r>
+    </w:p>
+    <w:p>
+      <w:pPr>
+        <w:spacing w:after="0" w:before="0" w:line="360"/>
+        <w:ind w:firstLine="709"/>
+        <w:jc w:val="both"/>
+      </w:pPr>
+      <w:r>
+        <w:rPr>
+          <w:rFonts w:ascii="Arial" w:cs="Arial" w:eastAsia="Arial" w:hAnsi="Arial"/>
+          <w:sz w:val="24"/>
+          <w:szCs w:val="24"/>
+        </w:rPr>
+        <w:t xml:space="preserve">Na etapa 3, o servidor local receberá um sistema operacional Linux de suporte estendido (Debian 12 ou Ubuntu Server 24.04 LTS), endereço IP fixo e a versão estável mais recente do Pi-hole. Serão configuradas listas de bloqueio por categoria, a partir das fontes discutidas na seção 3.3, uma lista local de domínios indesejados, definida com o responsável pelo setor e aplicada apenas ao grupo de clientes desse setor, uma lista de permissão com domínios de sistemas utilizados pelo órgão e, ao menos, dois grupos de clientes com políticas distintas. No roteador ou </w:t>
       </w:r>
       <w:r>
         <w:rPr>
@@ -5131,7 +5214,7 @@
                 <w:sz w:val="20"/>
                 <w:szCs w:val="20"/>
               </w:rPr>
-              <w:t xml:space="preserve"> e conteúdo criminoso), extraída de fontes independentes das listas utilizadas</w:t>
+              <w:t xml:space="preserve"> e conteúdo criminoso), extraída de fontes independentes das listas utilizadas, com tamanho, origem, data de coleta e critério de classificação registrados</w:t>
             </w:r>
           </w:p>
         </w:tc>
@@ -5415,7 +5498,7 @@
                 <w:sz w:val="20"/>
                 <w:szCs w:val="20"/>
               </w:rPr>
-              <w:t xml:space="preserve">Medir o tempo de resposta de um mesmo conjunto de consultas com o DNS atual e com o Pi-hole, com e sem </w:t>
+              <w:t xml:space="preserve">Medir o tempo de resposta de um mesmo conjunto de consultas com o DNS atual e com o Pi-hole, com </w:t>
             </w:r>
             <w:r>
               <w:rPr>
@@ -5429,30 +5512,6 @@
               </w:rPr>
               <w:t xml:space="preserve">cache</w:t>
             </w:r>
-          </w:p>
-        </w:tc>
-        <w:tc>
-          <w:tcPr>
-            <w:tcW w:type="dxa" w:w="1898"/>
-            <w:tcBorders>
-              <w:top w:val="single" w:color="000000" w:sz="4"/>
-              <w:left w:val="single" w:color="000000" w:sz="4"/>
-              <w:bottom w:val="single" w:color="000000" w:sz="4"/>
-              <w:right w:val="single" w:color="000000" w:sz="4"/>
-            </w:tcBorders>
-            <w:tcMar>
-              <w:top w:type="dxa" w:w="40"/>
-              <w:left w:type="dxa" w:w="80"/>
-              <w:bottom w:type="dxa" w:w="40"/>
-              <w:right w:type="dxa" w:w="80"/>
-            </w:tcMar>
-            <w:vAlign w:val="center"/>
-          </w:tcPr>
-          <w:p>
-            <w:pPr>
-              <w:spacing w:line="240"/>
-              <w:jc w:val="left"/>
-            </w:pPr>
             <w:r>
               <w:rPr>
                 <w:rFonts w:ascii="Arial" w:cs="Arial" w:eastAsia="Arial" w:hAnsi="Arial"/>
@@ -5461,7 +5520,41 @@
                 <w:sz w:val="20"/>
                 <w:szCs w:val="20"/>
               </w:rPr>
-              <w:t xml:space="preserve">Tempo médio e mediana de resposta (ms)</w:t>
+              <w:t xml:space="preserve"> frio e aquecido, em medições repetidas</w:t>
+            </w:r>
+          </w:p>
+        </w:tc>
+        <w:tc>
+          <w:tcPr>
+            <w:tcW w:type="dxa" w:w="1898"/>
+            <w:tcBorders>
+              <w:top w:val="single" w:color="000000" w:sz="4"/>
+              <w:left w:val="single" w:color="000000" w:sz="4"/>
+              <w:bottom w:val="single" w:color="000000" w:sz="4"/>
+              <w:right w:val="single" w:color="000000" w:sz="4"/>
+            </w:tcBorders>
+            <w:tcMar>
+              <w:top w:type="dxa" w:w="40"/>
+              <w:left w:type="dxa" w:w="80"/>
+              <w:bottom w:type="dxa" w:w="40"/>
+              <w:right w:type="dxa" w:w="80"/>
+            </w:tcMar>
+            <w:vAlign w:val="center"/>
+          </w:tcPr>
+          <w:p>
+            <w:pPr>
+              <w:spacing w:line="240"/>
+              <w:jc w:val="left"/>
+            </w:pPr>
+            <w:r>
+              <w:rPr>
+                <w:rFonts w:ascii="Arial" w:cs="Arial" w:eastAsia="Arial" w:hAnsi="Arial"/>
+                <w:b w:val="false"/>
+                <w:bCs w:val="false"/>
+                <w:sz w:val="20"/>
+                <w:szCs w:val="20"/>
+              </w:rPr>
+              <w:t xml:space="preserve">Mediana e dispersão do tempo de resposta (ms)</w:t>
             </w:r>
           </w:p>
         </w:tc>
@@ -5711,6 +5804,312 @@
                 <w:sz w:val="20"/>
                 <w:szCs w:val="20"/>
               </w:rPr>
+              <w:t xml:space="preserve">Custo</w:t>
+            </w:r>
+          </w:p>
+        </w:tc>
+        <w:tc>
+          <w:tcPr>
+            <w:tcW w:type="dxa" w:w="3797"/>
+            <w:tcBorders>
+              <w:top w:val="single" w:color="000000" w:sz="4"/>
+              <w:left w:val="single" w:color="000000" w:sz="4"/>
+              <w:bottom w:val="single" w:color="000000" w:sz="4"/>
+              <w:right w:val="single" w:color="000000" w:sz="4"/>
+            </w:tcBorders>
+            <w:tcMar>
+              <w:top w:type="dxa" w:w="40"/>
+              <w:left w:type="dxa" w:w="80"/>
+              <w:bottom w:type="dxa" w:w="40"/>
+              <w:right w:type="dxa" w:w="80"/>
+            </w:tcMar>
+            <w:vAlign w:val="center"/>
+          </w:tcPr>
+          <w:p>
+            <w:pPr>
+              <w:spacing w:line="240"/>
+              <w:jc w:val="left"/>
+            </w:pPr>
+            <w:r>
+              <w:rPr>
+                <w:rFonts w:ascii="Arial" w:cs="Arial" w:eastAsia="Arial" w:hAnsi="Arial"/>
+                <w:b w:val="false"/>
+                <w:bCs w:val="false"/>
+                <w:sz w:val="20"/>
+                <w:szCs w:val="20"/>
+              </w:rPr>
+              <w:t xml:space="preserve">Registrar o custo de aquisição ou aproveitamento do servidor, o tempo de configuração, a manutenção necessária e, se viável, o consumo elétrico estimado</w:t>
+            </w:r>
+          </w:p>
+        </w:tc>
+        <w:tc>
+          <w:tcPr>
+            <w:tcW w:type="dxa" w:w="1898"/>
+            <w:tcBorders>
+              <w:top w:val="single" w:color="000000" w:sz="4"/>
+              <w:left w:val="single" w:color="000000" w:sz="4"/>
+              <w:bottom w:val="single" w:color="000000" w:sz="4"/>
+              <w:right w:val="single" w:color="000000" w:sz="4"/>
+            </w:tcBorders>
+            <w:tcMar>
+              <w:top w:type="dxa" w:w="40"/>
+              <w:left w:type="dxa" w:w="80"/>
+              <w:bottom w:type="dxa" w:w="40"/>
+              <w:right w:type="dxa" w:w="80"/>
+            </w:tcMar>
+            <w:vAlign w:val="center"/>
+          </w:tcPr>
+          <w:p>
+            <w:pPr>
+              <w:spacing w:line="240"/>
+              <w:jc w:val="left"/>
+            </w:pPr>
+            <w:r>
+              <w:rPr>
+                <w:rFonts w:ascii="Arial" w:cs="Arial" w:eastAsia="Arial" w:hAnsi="Arial"/>
+                <w:b w:val="false"/>
+                <w:bCs w:val="false"/>
+                <w:sz w:val="20"/>
+                <w:szCs w:val="20"/>
+              </w:rPr>
+              <w:t xml:space="preserve">Custo (R$), tempo (h) e consumo estimado (kWh/mês)</w:t>
+            </w:r>
+          </w:p>
+        </w:tc>
+        <w:tc>
+          <w:tcPr>
+            <w:tcW w:type="dxa" w:w="1901"/>
+            <w:tcBorders>
+              <w:top w:val="single" w:color="000000" w:sz="4"/>
+              <w:left w:val="single" w:color="000000" w:sz="4"/>
+              <w:bottom w:val="single" w:color="000000" w:sz="4"/>
+              <w:right w:val="single" w:color="000000" w:sz="4"/>
+            </w:tcBorders>
+            <w:tcMar>
+              <w:top w:type="dxa" w:w="40"/>
+              <w:left w:type="dxa" w:w="80"/>
+              <w:bottom w:type="dxa" w:w="40"/>
+              <w:right w:type="dxa" w:w="80"/>
+            </w:tcMar>
+            <w:vAlign w:val="center"/>
+          </w:tcPr>
+          <w:p>
+            <w:pPr>
+              <w:spacing w:line="240"/>
+              <w:jc w:val="left"/>
+            </w:pPr>
+            <w:r>
+              <w:rPr>
+                <w:rFonts w:ascii="Arial" w:cs="Arial" w:eastAsia="Arial" w:hAnsi="Arial"/>
+                <w:b w:val="false"/>
+                <w:bCs w:val="false"/>
+                <w:sz w:val="20"/>
+                <w:szCs w:val="20"/>
+              </w:rPr>
+              <w:t xml:space="preserve">Registro de implantação</w:t>
+            </w:r>
+          </w:p>
+        </w:tc>
+      </w:tr>
+      <w:tr>
+        <w:trPr>
+          <w:cantSplit/>
+          <w:tblHeader w:val="off"/>
+        </w:trPr>
+        <w:tc>
+          <w:tcPr>
+            <w:tcW w:type="dxa" w:w="1476"/>
+            <w:tcBorders>
+              <w:top w:val="single" w:color="000000" w:sz="4"/>
+              <w:left w:val="single" w:color="000000" w:sz="4"/>
+              <w:bottom w:val="single" w:color="000000" w:sz="4"/>
+              <w:right w:val="single" w:color="000000" w:sz="4"/>
+            </w:tcBorders>
+            <w:tcMar>
+              <w:top w:type="dxa" w:w="40"/>
+              <w:left w:type="dxa" w:w="80"/>
+              <w:bottom w:type="dxa" w:w="40"/>
+              <w:right w:type="dxa" w:w="80"/>
+            </w:tcMar>
+            <w:vAlign w:val="center"/>
+          </w:tcPr>
+          <w:p>
+            <w:pPr>
+              <w:spacing w:line="240"/>
+              <w:jc w:val="left"/>
+            </w:pPr>
+            <w:r>
+              <w:rPr>
+                <w:rFonts w:ascii="Arial" w:cs="Arial" w:eastAsia="Arial" w:hAnsi="Arial"/>
+                <w:b w:val="false"/>
+                <w:bCs w:val="false"/>
+                <w:sz w:val="20"/>
+                <w:szCs w:val="20"/>
+              </w:rPr>
+              <w:t xml:space="preserve">Confiabilidade</w:t>
+            </w:r>
+          </w:p>
+        </w:tc>
+        <w:tc>
+          <w:tcPr>
+            <w:tcW w:type="dxa" w:w="3797"/>
+            <w:tcBorders>
+              <w:top w:val="single" w:color="000000" w:sz="4"/>
+              <w:left w:val="single" w:color="000000" w:sz="4"/>
+              <w:bottom w:val="single" w:color="000000" w:sz="4"/>
+              <w:right w:val="single" w:color="000000" w:sz="4"/>
+            </w:tcBorders>
+            <w:tcMar>
+              <w:top w:type="dxa" w:w="40"/>
+              <w:left w:type="dxa" w:w="80"/>
+              <w:bottom w:type="dxa" w:w="40"/>
+              <w:right w:type="dxa" w:w="80"/>
+            </w:tcMar>
+            <w:vAlign w:val="center"/>
+          </w:tcPr>
+          <w:p>
+            <w:pPr>
+              <w:spacing w:line="240"/>
+              <w:jc w:val="left"/>
+            </w:pPr>
+            <w:r>
+              <w:rPr>
+                <w:rFonts w:ascii="Arial" w:cs="Arial" w:eastAsia="Arial" w:hAnsi="Arial"/>
+                <w:b w:val="false"/>
+                <w:bCs w:val="false"/>
+                <w:sz w:val="20"/>
+                <w:szCs w:val="20"/>
+              </w:rPr>
+              <w:t xml:space="preserve">Simular a indisponibilidade do servidor Pi-hole e uma regra de </w:t>
+            </w:r>
+            <w:r>
+              <w:rPr>
+                <w:rFonts w:ascii="Arial" w:cs="Arial" w:eastAsia="Arial" w:hAnsi="Arial"/>
+                <w:b w:val="false"/>
+                <w:bCs w:val="false"/>
+                <w:i/>
+                <w:iCs/>
+                <w:sz w:val="20"/>
+                <w:szCs w:val="20"/>
+              </w:rPr>
+              <w:t xml:space="preserve">firewall</w:t>
+            </w:r>
+            <w:r>
+              <w:rPr>
+                <w:rFonts w:ascii="Arial" w:cs="Arial" w:eastAsia="Arial" w:hAnsi="Arial"/>
+                <w:b w:val="false"/>
+                <w:bCs w:val="false"/>
+                <w:sz w:val="20"/>
+                <w:szCs w:val="20"/>
+              </w:rPr>
+              <w:t xml:space="preserve"> incorreta, registrando o comportamento da rede e a recuperação</w:t>
+            </w:r>
+          </w:p>
+        </w:tc>
+        <w:tc>
+          <w:tcPr>
+            <w:tcW w:type="dxa" w:w="1898"/>
+            <w:tcBorders>
+              <w:top w:val="single" w:color="000000" w:sz="4"/>
+              <w:left w:val="single" w:color="000000" w:sz="4"/>
+              <w:bottom w:val="single" w:color="000000" w:sz="4"/>
+              <w:right w:val="single" w:color="000000" w:sz="4"/>
+            </w:tcBorders>
+            <w:tcMar>
+              <w:top w:type="dxa" w:w="40"/>
+              <w:left w:type="dxa" w:w="80"/>
+              <w:bottom w:type="dxa" w:w="40"/>
+              <w:right w:type="dxa" w:w="80"/>
+            </w:tcMar>
+            <w:vAlign w:val="center"/>
+          </w:tcPr>
+          <w:p>
+            <w:pPr>
+              <w:spacing w:line="240"/>
+              <w:jc w:val="left"/>
+            </w:pPr>
+            <w:r>
+              <w:rPr>
+                <w:rFonts w:ascii="Arial" w:cs="Arial" w:eastAsia="Arial" w:hAnsi="Arial"/>
+                <w:b w:val="false"/>
+                <w:bCs w:val="false"/>
+                <w:sz w:val="20"/>
+                <w:szCs w:val="20"/>
+              </w:rPr>
+              <w:t xml:space="preserve">Tempo de recuperação e comportamento da rede</w:t>
+            </w:r>
+          </w:p>
+        </w:tc>
+        <w:tc>
+          <w:tcPr>
+            <w:tcW w:type="dxa" w:w="1901"/>
+            <w:tcBorders>
+              <w:top w:val="single" w:color="000000" w:sz="4"/>
+              <w:left w:val="single" w:color="000000" w:sz="4"/>
+              <w:bottom w:val="single" w:color="000000" w:sz="4"/>
+              <w:right w:val="single" w:color="000000" w:sz="4"/>
+            </w:tcBorders>
+            <w:tcMar>
+              <w:top w:type="dxa" w:w="40"/>
+              <w:left w:type="dxa" w:w="80"/>
+              <w:bottom w:type="dxa" w:w="40"/>
+              <w:right w:type="dxa" w:w="80"/>
+            </w:tcMar>
+            <w:vAlign w:val="center"/>
+          </w:tcPr>
+          <w:p>
+            <w:pPr>
+              <w:spacing w:line="240"/>
+              <w:jc w:val="left"/>
+            </w:pPr>
+            <w:r>
+              <w:rPr>
+                <w:rFonts w:ascii="Arial" w:cs="Arial" w:eastAsia="Arial" w:hAnsi="Arial"/>
+                <w:b w:val="false"/>
+                <w:bCs w:val="false"/>
+                <w:sz w:val="20"/>
+                <w:szCs w:val="20"/>
+              </w:rPr>
+              <w:t xml:space="preserve">Roteiro de testes e registro em planilha</w:t>
+            </w:r>
+          </w:p>
+        </w:tc>
+      </w:tr>
+      <w:tr>
+        <w:trPr>
+          <w:cantSplit/>
+          <w:tblHeader w:val="off"/>
+        </w:trPr>
+        <w:tc>
+          <w:tcPr>
+            <w:tcW w:type="dxa" w:w="1476"/>
+            <w:tcBorders>
+              <w:top w:val="single" w:color="000000" w:sz="4"/>
+              <w:left w:val="single" w:color="000000" w:sz="4"/>
+              <w:bottom w:val="single" w:color="000000" w:sz="4"/>
+              <w:right w:val="single" w:color="000000" w:sz="4"/>
+            </w:tcBorders>
+            <w:tcMar>
+              <w:top w:type="dxa" w:w="40"/>
+              <w:left w:type="dxa" w:w="80"/>
+              <w:bottom w:type="dxa" w:w="40"/>
+              <w:right w:type="dxa" w:w="80"/>
+            </w:tcMar>
+            <w:vAlign w:val="center"/>
+          </w:tcPr>
+          <w:p>
+            <w:pPr>
+              <w:spacing w:line="240"/>
+              <w:jc w:val="left"/>
+            </w:pPr>
+            <w:r>
+              <w:rPr>
+                <w:rFonts w:ascii="Arial" w:cs="Arial" w:eastAsia="Arial" w:hAnsi="Arial"/>
+                <w:b w:val="false"/>
+                <w:bCs w:val="false"/>
+                <w:sz w:val="20"/>
+                <w:szCs w:val="20"/>
+              </w:rPr>
               <w:t xml:space="preserve">Grupos</w:t>
             </w:r>
           </w:p>
@@ -5830,7 +6229,7 @@
           <w:sz w:val="20"/>
           <w:szCs w:val="20"/>
         </w:rPr>
-        <w:t xml:space="preserve">Fonte: Elaborado pelo autor (2026).</w:t>
+        <w:t xml:space="preserve">Fonte: Elaborado pelos autores (2026).</w:t>
       </w:r>
     </w:p>
     <w:p>
@@ -5845,7 +6244,76 @@
           <w:sz w:val="24"/>
           <w:szCs w:val="24"/>
         </w:rPr>
-        <w:t xml:space="preserve">Os parâmetros de referência para a análise, a serem validados com o orientador, são: taxa de bloqueio igual ou superior a 90% nas categorias testadas; taxa de falsos positivos inferior a 2% na amostra de domínios legítimos; e acréscimo inferior a 10% no tempo mediano de resposta em relação ao DNS atualmente utilizado.</w:t>
+        <w:t xml:space="preserve">Os critérios de avaliação, definidos antes da execução dos testes e a serem validados com o orientador, não são resultados esperados nem garantidos; são eles: taxa de bloqueio igual ou superior a 90% nas categorias testadas; taxa de falsos positivos inferior a 2% na amostra de domínios legítimos; e acréscimo inferior a 10% no tempo mediano de resposta em relação ao DNS atualmente utilizado.</w:t>
+      </w:r>
+    </w:p>
+    <w:p>
+      <w:pPr>
+        <w:spacing w:after="0" w:before="0" w:line="360"/>
+        <w:ind w:firstLine="709"/>
+        <w:jc w:val="both"/>
+      </w:pPr>
+      <w:r>
+        <w:rPr>
+          <w:rFonts w:ascii="Arial" w:cs="Arial" w:eastAsia="Arial" w:hAnsi="Arial"/>
+          <w:sz w:val="24"/>
+          <w:szCs w:val="24"/>
+        </w:rPr>
+        <w:t xml:space="preserve">No diagnóstico da etapa 2, será confirmado se o roteador TP-Link Aginet EX511 permite definir o DNS distribuído por DHCP e criar regras de saída que bloqueiem DNS externo; caso não permita, serão documentadas alternativas, como o uso de um </w:t>
+      </w:r>
+      <w:r>
+        <w:rPr>
+          <w:rFonts w:ascii="Arial" w:cs="Arial" w:eastAsia="Arial" w:hAnsi="Arial"/>
+          <w:i/>
+          <w:iCs/>
+          <w:sz w:val="24"/>
+          <w:szCs w:val="24"/>
+        </w:rPr>
+        <w:t xml:space="preserve">firewall</w:t>
+      </w:r>
+      <w:r>
+        <w:rPr>
+          <w:rFonts w:ascii="Arial" w:cs="Arial" w:eastAsia="Arial" w:hAnsi="Arial"/>
+          <w:sz w:val="24"/>
+          <w:szCs w:val="24"/>
+        </w:rPr>
+        <w:t xml:space="preserve"> adicional ou do próprio servidor como DHCP. Ressalta-se que o Pi-hole bloqueia nomes de domínio das categorias escolhidas, e não o conteúdo das páginas, de modo que os resultados não permitirão afirmar que o acesso a conteúdo indevido foi impedido por completo nem que os riscos de </w:t>
+      </w:r>
+      <w:r>
+        <w:rPr>
+          <w:rFonts w:ascii="Arial" w:cs="Arial" w:eastAsia="Arial" w:hAnsi="Arial"/>
+          <w:i/>
+          <w:iCs/>
+          <w:sz w:val="24"/>
+          <w:szCs w:val="24"/>
+        </w:rPr>
+        <w:t xml:space="preserve">malware</w:t>
+      </w:r>
+      <w:r>
+        <w:rPr>
+          <w:rFonts w:ascii="Arial" w:cs="Arial" w:eastAsia="Arial" w:hAnsi="Arial"/>
+          <w:sz w:val="24"/>
+          <w:szCs w:val="24"/>
+        </w:rPr>
+        <w:t xml:space="preserve"> e </w:t>
+      </w:r>
+      <w:r>
+        <w:rPr>
+          <w:rFonts w:ascii="Arial" w:cs="Arial" w:eastAsia="Arial" w:hAnsi="Arial"/>
+          <w:i/>
+          <w:iCs/>
+          <w:sz w:val="24"/>
+          <w:szCs w:val="24"/>
+        </w:rPr>
+        <w:t xml:space="preserve">phishing</w:t>
+      </w:r>
+      <w:r>
+        <w:rPr>
+          <w:rFonts w:ascii="Arial" w:cs="Arial" w:eastAsia="Arial" w:hAnsi="Arial"/>
+          <w:sz w:val="24"/>
+          <w:szCs w:val="24"/>
+        </w:rPr>
+        <w:t xml:space="preserve"> foram eliminados.</w:t>
       </w:r>
     </w:p>
     <w:p>
@@ -5973,7 +6441,7 @@
           <w:sz w:val="20"/>
           <w:szCs w:val="20"/>
         </w:rPr>
-        <w:t xml:space="preserve">Fonte: Elaborado pelo autor (2026).</w:t>
+        <w:t xml:space="preserve">Fonte: Elaborado pelos autores (2026).</w:t>
       </w:r>
     </w:p>
     <w:p>
@@ -6018,7 +6486,7 @@
           <w:sz w:val="24"/>
           <w:szCs w:val="24"/>
         </w:rPr>
-        <w:t xml:space="preserve">b) políticas de filtragem: listas de bloqueio por categoria, expressões regulares, lista de permissão para sistemas governamentais e grupos, por exemplo, "Administração", "Atendimento" e "Visitantes", com regras distintas;</w:t>
+        <w:t xml:space="preserve">b) políticas de filtragem: listas de bloqueio por categoria, lista local de domínios indesejados definida com cada setor, expressões regulares, lista de permissão para sistemas governamentais e grupos, por exemplo, "Administração", "Atendimento" e "Visitantes", com regras distintas;</w:t>
       </w:r>
     </w:p>
     <w:p>
@@ -6221,7 +6689,7 @@
           <w:sz w:val="24"/>
           <w:szCs w:val="24"/>
         </w:rPr>
-        <w:t xml:space="preserve">A pesquisa será iniciada somente após a obtenção de termo de anuência da instituição. A entrevista com o responsável técnico tratará exclusivamente da infraestrutura e dos procedimentos do órgão, e o entrevistado assinará termo de consentimento livre e esclarecido. Os registros do Pi-hole utilizados na análise serão agregados e anonimizados, com o uso dos níveis de privacidade da própria ferramenta, sem identificação de servidores, em conformidade com a LGPD (BRASIL, 2018b). A necessidade de submissão ao Comitê de Ética em Pesquisa será verificada com o orientador, à luz da Resolução nº 510/2016 do Conselho Nacional de Saúde (BRASIL, 2016).</w:t>
+        <w:t xml:space="preserve">A pesquisa será iniciada somente após a obtenção de termo de anuência da instituição. A entrevista com o responsável técnico tratará exclusivamente da infraestrutura e dos procedimentos do órgão, e o entrevistado assinará termo de consentimento livre e esclarecido. Os registros do Pi-hole utilizados na análise serão agregados e anonimizados, com o uso dos níveis de privacidade da própria ferramenta, sem identificação de servidores, em conformidade com a LGPD (BRASIL, 2018). Os registros terão como finalidade exclusiva a avaliação do filtro e a segurança da rede, com acesso restrito ao responsável técnico e aos pesquisadores, prazo de retenção definido com a instituição e limitado ao necessário para a pesquisa, e exclusão ao término do estudo (AUTORIDADE NACIONAL DE PROTEÇÃO DE DADOS, 2023a, 2023b). A necessidade de submissão ao Comitê de Ética em Pesquisa será verificada com o orientador, à luz da Resolução nº 510/2016 do Conselho Nacional de Saúde (BRASIL, 2016).</w:t>
       </w:r>
     </w:p>
     <w:p>
@@ -8627,7 +9095,7 @@
           <w:sz w:val="20"/>
           <w:szCs w:val="20"/>
         </w:rPr>
-        <w:t xml:space="preserve">Fonte: Elaborado pelo autor (2026).</w:t>
+        <w:t xml:space="preserve">Fonte: Elaborado pelos autores (2026).</w:t>
       </w:r>
     </w:p>
     <w:p>
@@ -8774,25 +9242,25 @@
           <w:sz w:val="24"/>
           <w:szCs w:val="24"/>
         </w:rPr>
-        <w:t xml:space="preserve">BARDIN, Laurence. </w:t>
-      </w:r>
-      <w:r>
-        <w:rPr>
-          <w:rFonts w:ascii="Arial" w:cs="Arial" w:eastAsia="Arial" w:hAnsi="Arial"/>
-          <w:b/>
-          <w:bCs/>
-          <w:sz w:val="24"/>
-          <w:szCs w:val="24"/>
-        </w:rPr>
-        <w:t xml:space="preserve">Análise de conteúdo</w:t>
-      </w:r>
-      <w:r>
-        <w:rPr>
-          <w:rFonts w:ascii="Arial" w:cs="Arial" w:eastAsia="Arial" w:hAnsi="Arial"/>
-          <w:sz w:val="24"/>
-          <w:szCs w:val="24"/>
-        </w:rPr>
-        <w:t xml:space="preserve">. São Paulo: Edições 70, 2016.</w:t>
+        <w:t xml:space="preserve">AUTORIDADE NACIONAL DE PROTEÇÃO DE DADOS. </w:t>
+      </w:r>
+      <w:r>
+        <w:rPr>
+          <w:rFonts w:ascii="Arial" w:cs="Arial" w:eastAsia="Arial" w:hAnsi="Arial"/>
+          <w:b/>
+          <w:bCs/>
+          <w:sz w:val="24"/>
+          <w:szCs w:val="24"/>
+        </w:rPr>
+        <w:t xml:space="preserve">Tratamento de dados pessoais pelo Poder Público</w:t>
+      </w:r>
+      <w:r>
+        <w:rPr>
+          <w:rFonts w:ascii="Arial" w:cs="Arial" w:eastAsia="Arial" w:hAnsi="Arial"/>
+          <w:sz w:val="24"/>
+          <w:szCs w:val="24"/>
+        </w:rPr>
+        <w:t xml:space="preserve">: guia orientativo. Versão 2.0. Brasília, DF: ANPD, jun. 2023a. Disponível em: https://www.gov.br/anpd/pt-br/centrais-de-conteudo/materiais-educativos-e-publicacoes/guia-poder-publico-anpd-versao-final.pdf. Acesso em: 28 out. 2026.</w:t>
       </w:r>
     </w:p>
     <w:p>
@@ -8806,6 +9274,70 @@
           <w:sz w:val="24"/>
           <w:szCs w:val="24"/>
         </w:rPr>
+        <w:t xml:space="preserve">AUTORIDADE NACIONAL DE PROTEÇÃO DE DADOS. </w:t>
+      </w:r>
+      <w:r>
+        <w:rPr>
+          <w:rFonts w:ascii="Arial" w:cs="Arial" w:eastAsia="Arial" w:hAnsi="Arial"/>
+          <w:b/>
+          <w:bCs/>
+          <w:sz w:val="24"/>
+          <w:szCs w:val="24"/>
+        </w:rPr>
+        <w:t xml:space="preserve">Tratamento de dados pessoais para fins acadêmicos e para a realização de estudos e pesquisas</w:t>
+      </w:r>
+      <w:r>
+        <w:rPr>
+          <w:rFonts w:ascii="Arial" w:cs="Arial" w:eastAsia="Arial" w:hAnsi="Arial"/>
+          <w:sz w:val="24"/>
+          <w:szCs w:val="24"/>
+        </w:rPr>
+        <w:t xml:space="preserve">: guia orientativo. Brasília, DF: ANPD, 2023b. Disponível em: https://www.gov.br/anpd/pt-br/centrais-de-conteudo/materiais-educativos-e-publicacoes/guia-orientativo-tratamento-de-dados-pessoais-para-fins-academicos-e-para-a-realizacao-de-estudos-e-pesquisas. Acesso em: 28 out. 2026.</w:t>
+      </w:r>
+    </w:p>
+    <w:p>
+      <w:pPr>
+        <w:spacing w:after="240" w:line="240"/>
+        <w:jc w:val="left"/>
+      </w:pPr>
+      <w:r>
+        <w:rPr>
+          <w:rFonts w:ascii="Arial" w:cs="Arial" w:eastAsia="Arial" w:hAnsi="Arial"/>
+          <w:sz w:val="24"/>
+          <w:szCs w:val="24"/>
+        </w:rPr>
+        <w:t xml:space="preserve">BARDIN, Laurence. </w:t>
+      </w:r>
+      <w:r>
+        <w:rPr>
+          <w:rFonts w:ascii="Arial" w:cs="Arial" w:eastAsia="Arial" w:hAnsi="Arial"/>
+          <w:b/>
+          <w:bCs/>
+          <w:sz w:val="24"/>
+          <w:szCs w:val="24"/>
+        </w:rPr>
+        <w:t xml:space="preserve">Análise de conteúdo</w:t>
+      </w:r>
+      <w:r>
+        <w:rPr>
+          <w:rFonts w:ascii="Arial" w:cs="Arial" w:eastAsia="Arial" w:hAnsi="Arial"/>
+          <w:sz w:val="24"/>
+          <w:szCs w:val="24"/>
+        </w:rPr>
+        <w:t xml:space="preserve">. São Paulo: Edições 70, 2016.</w:t>
+      </w:r>
+    </w:p>
+    <w:p>
+      <w:pPr>
+        <w:spacing w:after="240" w:line="240"/>
+        <w:jc w:val="left"/>
+      </w:pPr>
+      <w:r>
+        <w:rPr>
+          <w:rFonts w:ascii="Arial" w:cs="Arial" w:eastAsia="Arial" w:hAnsi="Arial"/>
+          <w:sz w:val="24"/>
+          <w:szCs w:val="24"/>
+        </w:rPr>
         <w:t xml:space="preserve">BLACK, Steven. </w:t>
       </w:r>
       <w:r>
@@ -8984,7 +9516,7 @@
           <w:sz w:val="24"/>
           <w:szCs w:val="24"/>
         </w:rPr>
-        <w:t xml:space="preserve">BRASIL. Decreto nº 9.637, de 26 de dezembro de 2018. Institui a Política Nacional de Segurança da Informação, dispõe sobre a governança da segurança da informação, e altera o Decreto nº 2.295, de 4 de agosto de 1997. </w:t>
+        <w:t xml:space="preserve">BRASIL. Lei nº 13.709, de 14 de agosto de 2018. Lei Geral de Proteção de Dados Pessoais (LGPD). </w:t>
       </w:r>
       <w:r>
         <w:rPr>
@@ -9002,7 +9534,7 @@
           <w:sz w:val="24"/>
           <w:szCs w:val="24"/>
         </w:rPr>
-        <w:t xml:space="preserve">: seção 1, Brasília, DF, 27 dez. 2018a. Disponível em: https://www.planalto.gov.br/ccivil_03/_ato2015-2018/2018/decreto/d9637.htm. Acesso em: 26 out. 2026.</w:t>
+        <w:t xml:space="preserve">: seção 1, Brasília, DF, 15 ago. 2018. Disponível em: https://www.planalto.gov.br/ccivil_03/_ato2015-2018/2018/lei/l13709.htm. Acesso em: 26 out. 2026.</w:t>
       </w:r>
     </w:p>
     <w:p>
@@ -9016,7 +9548,7 @@
           <w:sz w:val="24"/>
           <w:szCs w:val="24"/>
         </w:rPr>
-        <w:t xml:space="preserve">BRASIL. Lei nº 13.709, de 14 de agosto de 2018. Lei Geral de Proteção de Dados Pessoais (LGPD). </w:t>
+        <w:t xml:space="preserve">BRASIL. Decreto nº 11.856, de 26 de dezembro de 2023. Institui a Política Nacional de Cibersegurança e o Comitê Nacional de Cibersegurança. </w:t>
       </w:r>
       <w:r>
         <w:rPr>
@@ -9034,7 +9566,7 @@
           <w:sz w:val="24"/>
           <w:szCs w:val="24"/>
         </w:rPr>
-        <w:t xml:space="preserve">: seção 1, Brasília, DF, 15 ago. 2018b. Disponível em: https://www.planalto.gov.br/ccivil_03/_ato2015-2018/2018/lei/l13709.htm. Acesso em: 26 out. 2026.</w:t>
+        <w:t xml:space="preserve">: seção 1, Brasília, DF, 27 dez. 2023. Disponível em: https://www.planalto.gov.br/ccivil_03/_ato2023-2026/2023/decreto/d11856.htm. Acesso em: 26 out. 2026.</w:t>
       </w:r>
     </w:p>
     <w:p>
@@ -9048,25 +9580,25 @@
           <w:sz w:val="24"/>
           <w:szCs w:val="24"/>
         </w:rPr>
-        <w:t xml:space="preserve">BRASIL. Decreto nº 11.856, de 26 de dezembro de 2023. Institui a Política Nacional de Cibersegurança e o Comitê Nacional de Cibersegurança. </w:t>
-      </w:r>
-      <w:r>
-        <w:rPr>
-          <w:rFonts w:ascii="Arial" w:cs="Arial" w:eastAsia="Arial" w:hAnsi="Arial"/>
-          <w:b/>
-          <w:bCs/>
-          <w:sz w:val="24"/>
-          <w:szCs w:val="24"/>
-        </w:rPr>
-        <w:t xml:space="preserve">Diário Oficial da União</w:t>
-      </w:r>
-      <w:r>
-        <w:rPr>
-          <w:rFonts w:ascii="Arial" w:cs="Arial" w:eastAsia="Arial" w:hAnsi="Arial"/>
-          <w:sz w:val="24"/>
-          <w:szCs w:val="24"/>
-        </w:rPr>
-        <w:t xml:space="preserve">: seção 1, Brasília, DF, 27 dez. 2023. Disponível em: https://www.planalto.gov.br/ccivil_03/_ato2023-2026/2023/decreto/d11856.htm. Acesso em: 26 out. 2026.</w:t>
+        <w:t xml:space="preserve">BRASIL. Ministério da Gestão e da Inovação em Serviços Públicos. Secretaria de Governo Digital. </w:t>
+      </w:r>
+      <w:r>
+        <w:rPr>
+          <w:rFonts w:ascii="Arial" w:cs="Arial" w:eastAsia="Arial" w:hAnsi="Arial"/>
+          <w:b/>
+          <w:bCs/>
+          <w:sz w:val="24"/>
+          <w:szCs w:val="24"/>
+        </w:rPr>
+        <w:t xml:space="preserve">Guia do framework de privacidade e segurança da informação</w:t>
+      </w:r>
+      <w:r>
+        <w:rPr>
+          <w:rFonts w:ascii="Arial" w:cs="Arial" w:eastAsia="Arial" w:hAnsi="Arial"/>
+          <w:sz w:val="24"/>
+          <w:szCs w:val="24"/>
+        </w:rPr>
+        <w:t xml:space="preserve">. Versão 1.1.3. Brasília, DF: SGD, 2024. Disponível em: https://www.gov.br/governodigital/pt-br/privacidade-e-seguranca/ppsi/guia_framework_psi.pdf. Acesso em: 26 out. 2026.</w:t>
       </w:r>
     </w:p>
     <w:p>
@@ -9080,25 +9612,25 @@
           <w:sz w:val="24"/>
           <w:szCs w:val="24"/>
         </w:rPr>
-        <w:t xml:space="preserve">BRASIL. Ministério da Gestão e da Inovação em Serviços Públicos. Secretaria de Governo Digital. </w:t>
-      </w:r>
-      <w:r>
-        <w:rPr>
-          <w:rFonts w:ascii="Arial" w:cs="Arial" w:eastAsia="Arial" w:hAnsi="Arial"/>
-          <w:b/>
-          <w:bCs/>
-          <w:sz w:val="24"/>
-          <w:szCs w:val="24"/>
-        </w:rPr>
-        <w:t xml:space="preserve">Guia do framework de privacidade e segurança da informação</w:t>
-      </w:r>
-      <w:r>
-        <w:rPr>
-          <w:rFonts w:ascii="Arial" w:cs="Arial" w:eastAsia="Arial" w:hAnsi="Arial"/>
-          <w:sz w:val="24"/>
-          <w:szCs w:val="24"/>
-        </w:rPr>
-        <w:t xml:space="preserve">. Versão 1.1.3. Brasília, DF: SGD, 2024. Disponível em: https://www.gov.br/governodigital/pt-br/privacidade-e-seguranca/ppsi/guia_framework_psi.pdf. Acesso em: 26 out. 2026.</w:t>
+        <w:t xml:space="preserve">BRASIL. Decreto nº 12.572, de 4 de agosto de 2025. Institui a Política Nacional de Segurança da Informação e dispõe sobre a governança da segurança da informação. </w:t>
+      </w:r>
+      <w:r>
+        <w:rPr>
+          <w:rFonts w:ascii="Arial" w:cs="Arial" w:eastAsia="Arial" w:hAnsi="Arial"/>
+          <w:b/>
+          <w:bCs/>
+          <w:sz w:val="24"/>
+          <w:szCs w:val="24"/>
+        </w:rPr>
+        <w:t xml:space="preserve">Diário Oficial da União</w:t>
+      </w:r>
+      <w:r>
+        <w:rPr>
+          <w:rFonts w:ascii="Arial" w:cs="Arial" w:eastAsia="Arial" w:hAnsi="Arial"/>
+          <w:sz w:val="24"/>
+          <w:szCs w:val="24"/>
+        </w:rPr>
+        <w:t xml:space="preserve">: seção 1, Brasília, DF, 5 ago. 2025a. Disponível em: https://www.planalto.gov.br/ccivil_03/_ato2023-2026/2025/decreto/d12572.htm. Acesso em: 28 out. 2026.</w:t>
       </w:r>
     </w:p>
     <w:p>
@@ -9112,25 +9644,25 @@
           <w:sz w:val="24"/>
           <w:szCs w:val="24"/>
         </w:rPr>
-        <w:t xml:space="preserve">CENTER FOR INTERNET SECURITY. </w:t>
-      </w:r>
-      <w:r>
-        <w:rPr>
-          <w:rFonts w:ascii="Arial" w:cs="Arial" w:eastAsia="Arial" w:hAnsi="Arial"/>
-          <w:b/>
-          <w:bCs/>
-          <w:sz w:val="24"/>
-          <w:szCs w:val="24"/>
-        </w:rPr>
-        <w:t xml:space="preserve">CIS Critical Security Controls</w:t>
-      </w:r>
-      <w:r>
-        <w:rPr>
-          <w:rFonts w:ascii="Arial" w:cs="Arial" w:eastAsia="Arial" w:hAnsi="Arial"/>
-          <w:sz w:val="24"/>
-          <w:szCs w:val="24"/>
-        </w:rPr>
-        <w:t xml:space="preserve">: version 8.1. East Greenbush, NY: CIS, 2024. Disponível em: https://www.cisecurity.org/insights/white-papers/cis-critical-security-controls-v8-1. Acesso em: 26 out. 2026.</w:t>
+        <w:t xml:space="preserve">BRASIL. Decreto nº 12.573, de 4 de agosto de 2025. Institui a Estratégia Nacional de Cibersegurança. </w:t>
+      </w:r>
+      <w:r>
+        <w:rPr>
+          <w:rFonts w:ascii="Arial" w:cs="Arial" w:eastAsia="Arial" w:hAnsi="Arial"/>
+          <w:b/>
+          <w:bCs/>
+          <w:sz w:val="24"/>
+          <w:szCs w:val="24"/>
+        </w:rPr>
+        <w:t xml:space="preserve">Diário Oficial da União</w:t>
+      </w:r>
+      <w:r>
+        <w:rPr>
+          <w:rFonts w:ascii="Arial" w:cs="Arial" w:eastAsia="Arial" w:hAnsi="Arial"/>
+          <w:sz w:val="24"/>
+          <w:szCs w:val="24"/>
+        </w:rPr>
+        <w:t xml:space="preserve">: seção 1, Brasília, DF, 5 ago. 2025b. Disponível em: https://www.planalto.gov.br/ccivil_03/_ato2023-2026/2025/decreto/d12573.htm. Acesso em: 28 out. 2026.</w:t>
       </w:r>
     </w:p>
     <w:p>
@@ -9144,25 +9676,25 @@
           <w:sz w:val="24"/>
           <w:szCs w:val="24"/>
         </w:rPr>
-        <w:t xml:space="preserve">CENTRO REGIONAL DE ESTUDOS PARA O DESENVOLVIMENTO DA SOCIEDADE DA INFORMAÇÃO. </w:t>
-      </w:r>
-      <w:r>
-        <w:rPr>
-          <w:rFonts w:ascii="Arial" w:cs="Arial" w:eastAsia="Arial" w:hAnsi="Arial"/>
-          <w:b/>
-          <w:bCs/>
-          <w:sz w:val="24"/>
-          <w:szCs w:val="24"/>
-        </w:rPr>
-        <w:t xml:space="preserve">TIC Governo Eletrônico 2023</w:t>
-      </w:r>
-      <w:r>
-        <w:rPr>
-          <w:rFonts w:ascii="Arial" w:cs="Arial" w:eastAsia="Arial" w:hAnsi="Arial"/>
-          <w:sz w:val="24"/>
-          <w:szCs w:val="24"/>
-        </w:rPr>
-        <w:t xml:space="preserve">: pesquisa sobre o uso das tecnologias de informação e comunicação no setor público brasileiro: resumo executivo. São Paulo: Comitê Gestor da Internet no Brasil, 2024. Disponível em: https://cetic.br/media/docs/publicacoes/2/20240826104230/resumo_executivo_tic_governo_eletronico_2023.pdf. Acesso em: 26 out. 2026.</w:t>
+        <w:t xml:space="preserve">CENTER FOR INTERNET SECURITY. </w:t>
+      </w:r>
+      <w:r>
+        <w:rPr>
+          <w:rFonts w:ascii="Arial" w:cs="Arial" w:eastAsia="Arial" w:hAnsi="Arial"/>
+          <w:b/>
+          <w:bCs/>
+          <w:sz w:val="24"/>
+          <w:szCs w:val="24"/>
+        </w:rPr>
+        <w:t xml:space="preserve">CIS Critical Security Controls</w:t>
+      </w:r>
+      <w:r>
+        <w:rPr>
+          <w:rFonts w:ascii="Arial" w:cs="Arial" w:eastAsia="Arial" w:hAnsi="Arial"/>
+          <w:sz w:val="24"/>
+          <w:szCs w:val="24"/>
+        </w:rPr>
+        <w:t xml:space="preserve">: version 8.1. East Greenbush, NY: CIS, 2024. Disponível em: https://www.cisecurity.org/insights/white-papers/cis-critical-security-controls-v8-1. Acesso em: 26 out. 2026.</w:t>
       </w:r>
     </w:p>
     <w:p>
@@ -9176,25 +9708,25 @@
           <w:sz w:val="24"/>
           <w:szCs w:val="24"/>
         </w:rPr>
-        <w:t xml:space="preserve">CYBERSECURITY AND INFRASTRUCTURE SECURITY AGENCY. </w:t>
-      </w:r>
-      <w:r>
-        <w:rPr>
-          <w:rFonts w:ascii="Arial" w:cs="Arial" w:eastAsia="Arial" w:hAnsi="Arial"/>
-          <w:b/>
-          <w:bCs/>
-          <w:sz w:val="24"/>
-          <w:szCs w:val="24"/>
-        </w:rPr>
-        <w:t xml:space="preserve">Encrypted DNS implementation guidance</w:t>
-      </w:r>
-      <w:r>
-        <w:rPr>
-          <w:rFonts w:ascii="Arial" w:cs="Arial" w:eastAsia="Arial" w:hAnsi="Arial"/>
-          <w:sz w:val="24"/>
-          <w:szCs w:val="24"/>
-        </w:rPr>
-        <w:t xml:space="preserve">. Version 1.0. Washington, DC: CISA, 2024. Disponível em: https://www.cisa.gov/sites/default/files/2024-05/Encrypted%20DNS%20Implementation%20Guidance_508c.pdf. Acesso em: 26 out. 2026.</w:t>
+        <w:t xml:space="preserve">CENTRO REGIONAL DE ESTUDOS PARA O DESENVOLVIMENTO DA SOCIEDADE DA INFORMAÇÃO. </w:t>
+      </w:r>
+      <w:r>
+        <w:rPr>
+          <w:rFonts w:ascii="Arial" w:cs="Arial" w:eastAsia="Arial" w:hAnsi="Arial"/>
+          <w:b/>
+          <w:bCs/>
+          <w:sz w:val="24"/>
+          <w:szCs w:val="24"/>
+        </w:rPr>
+        <w:t xml:space="preserve">TIC Governo Eletrônico 2023</w:t>
+      </w:r>
+      <w:r>
+        <w:rPr>
+          <w:rFonts w:ascii="Arial" w:cs="Arial" w:eastAsia="Arial" w:hAnsi="Arial"/>
+          <w:sz w:val="24"/>
+          <w:szCs w:val="24"/>
+        </w:rPr>
+        <w:t xml:space="preserve">: pesquisa sobre o uso das tecnologias de informação e comunicação no setor público brasileiro: resumo executivo. São Paulo: Comitê Gestor da Internet no Brasil, 2024. Disponível em: https://cetic.br/media/docs/publicacoes/2/20240826104230/resumo_executivo_tic_governo_eletronico_2023.pdf. Acesso em: 26 out. 2026.</w:t>
       </w:r>
     </w:p>
     <w:p>
@@ -9208,25 +9740,25 @@
           <w:sz w:val="24"/>
           <w:szCs w:val="24"/>
         </w:rPr>
-        <w:t xml:space="preserve">DRESCH, Aline; LACERDA, Daniel Pacheco; ANTUNES JÚNIOR, José Antonio Valle. </w:t>
-      </w:r>
-      <w:r>
-        <w:rPr>
-          <w:rFonts w:ascii="Arial" w:cs="Arial" w:eastAsia="Arial" w:hAnsi="Arial"/>
-          <w:b/>
-          <w:bCs/>
-          <w:sz w:val="24"/>
-          <w:szCs w:val="24"/>
-        </w:rPr>
-        <w:t xml:space="preserve">Design science research</w:t>
-      </w:r>
-      <w:r>
-        <w:rPr>
-          <w:rFonts w:ascii="Arial" w:cs="Arial" w:eastAsia="Arial" w:hAnsi="Arial"/>
-          <w:sz w:val="24"/>
-          <w:szCs w:val="24"/>
-        </w:rPr>
-        <w:t xml:space="preserve">: método de pesquisa para avanço da ciência e tecnologia. Porto Alegre: Bookman, 2015.</w:t>
+        <w:t xml:space="preserve">CYBERSECURITY AND INFRASTRUCTURE SECURITY AGENCY. </w:t>
+      </w:r>
+      <w:r>
+        <w:rPr>
+          <w:rFonts w:ascii="Arial" w:cs="Arial" w:eastAsia="Arial" w:hAnsi="Arial"/>
+          <w:b/>
+          <w:bCs/>
+          <w:sz w:val="24"/>
+          <w:szCs w:val="24"/>
+        </w:rPr>
+        <w:t xml:space="preserve">Encrypted DNS implementation guidance</w:t>
+      </w:r>
+      <w:r>
+        <w:rPr>
+          <w:rFonts w:ascii="Arial" w:cs="Arial" w:eastAsia="Arial" w:hAnsi="Arial"/>
+          <w:sz w:val="24"/>
+          <w:szCs w:val="24"/>
+        </w:rPr>
+        <w:t xml:space="preserve">. Version 1.0. Washington, DC: CISA, 2024. Disponível em: https://www.cisa.gov/sites/default/files/2024-05/Encrypted%20DNS%20Implementation%20Guidance_508c.pdf. Acesso em: 26 out. 2026.</w:t>
       </w:r>
     </w:p>
     <w:p>
@@ -9240,6 +9772,38 @@
           <w:sz w:val="24"/>
           <w:szCs w:val="24"/>
         </w:rPr>
+        <w:t xml:space="preserve">DRESCH, Aline; LACERDA, Daniel Pacheco; ANTUNES JÚNIOR, José Antonio Valle. </w:t>
+      </w:r>
+      <w:r>
+        <w:rPr>
+          <w:rFonts w:ascii="Arial" w:cs="Arial" w:eastAsia="Arial" w:hAnsi="Arial"/>
+          <w:b/>
+          <w:bCs/>
+          <w:sz w:val="24"/>
+          <w:szCs w:val="24"/>
+        </w:rPr>
+        <w:t xml:space="preserve">Design science research</w:t>
+      </w:r>
+      <w:r>
+        <w:rPr>
+          <w:rFonts w:ascii="Arial" w:cs="Arial" w:eastAsia="Arial" w:hAnsi="Arial"/>
+          <w:sz w:val="24"/>
+          <w:szCs w:val="24"/>
+        </w:rPr>
+        <w:t xml:space="preserve">: método de pesquisa para avanço da ciência e tecnologia. Porto Alegre: Bookman, 2015.</w:t>
+      </w:r>
+    </w:p>
+    <w:p>
+      <w:pPr>
+        <w:spacing w:after="240" w:line="240"/>
+        <w:jc w:val="left"/>
+      </w:pPr>
+      <w:r>
+        <w:rPr>
+          <w:rFonts w:ascii="Arial" w:cs="Arial" w:eastAsia="Arial" w:hAnsi="Arial"/>
+          <w:sz w:val="24"/>
+          <w:szCs w:val="24"/>
+        </w:rPr>
         <w:t xml:space="preserve">ELAVARASI, R. </w:t>
       </w:r>
       <w:r>
@@ -9390,25 +9954,25 @@
           <w:sz w:val="24"/>
           <w:szCs w:val="24"/>
         </w:rPr>
-        <w:t xml:space="preserve">HOFFMAN, Paul; MCMANUS, Patrick. </w:t>
-      </w:r>
-      <w:r>
-        <w:rPr>
-          <w:rFonts w:ascii="Arial" w:cs="Arial" w:eastAsia="Arial" w:hAnsi="Arial"/>
-          <w:b/>
-          <w:bCs/>
-          <w:sz w:val="24"/>
-          <w:szCs w:val="24"/>
-        </w:rPr>
-        <w:t xml:space="preserve">RFC 8484</w:t>
-      </w:r>
-      <w:r>
-        <w:rPr>
-          <w:rFonts w:ascii="Arial" w:cs="Arial" w:eastAsia="Arial" w:hAnsi="Arial"/>
-          <w:sz w:val="24"/>
-          <w:szCs w:val="24"/>
-        </w:rPr>
-        <w:t xml:space="preserve">: DNS queries over HTTPS (DoH). [</w:t>
+        <w:t xml:space="preserve">HOFFMAN, Paul; FUJIWARA, Kazunori. </w:t>
+      </w:r>
+      <w:r>
+        <w:rPr>
+          <w:rFonts w:ascii="Arial" w:cs="Arial" w:eastAsia="Arial" w:hAnsi="Arial"/>
+          <w:b/>
+          <w:bCs/>
+          <w:sz w:val="24"/>
+          <w:szCs w:val="24"/>
+        </w:rPr>
+        <w:t xml:space="preserve">RFC 9499</w:t>
+      </w:r>
+      <w:r>
+        <w:rPr>
+          <w:rFonts w:ascii="Arial" w:cs="Arial" w:eastAsia="Arial" w:hAnsi="Arial"/>
+          <w:sz w:val="24"/>
+          <w:szCs w:val="24"/>
+        </w:rPr>
+        <w:t xml:space="preserve">: DNS terminology. [</w:t>
       </w:r>
       <w:r>
         <w:rPr>
@@ -9426,7 +9990,7 @@
           <w:sz w:val="24"/>
           <w:szCs w:val="24"/>
         </w:rPr>
-        <w:t xml:space="preserve">]: IETF, 2018. DOI: https://doi.org/10.17487/RFC8484.</w:t>
+        <w:t xml:space="preserve">]: IETF, 2024. DOI: https://doi.org/10.17487/RFC9499.</w:t>
       </w:r>
     </w:p>
     <w:p>
@@ -9440,7 +10004,25 @@
           <w:sz w:val="24"/>
           <w:szCs w:val="24"/>
         </w:rPr>
-        <w:t xml:space="preserve">HOUNSEL, Austin </w:t>
+        <w:t xml:space="preserve">HOFFMAN, Paul; MCMANUS, Patrick. </w:t>
+      </w:r>
+      <w:r>
+        <w:rPr>
+          <w:rFonts w:ascii="Arial" w:cs="Arial" w:eastAsia="Arial" w:hAnsi="Arial"/>
+          <w:b/>
+          <w:bCs/>
+          <w:sz w:val="24"/>
+          <w:szCs w:val="24"/>
+        </w:rPr>
+        <w:t xml:space="preserve">RFC 8484</w:t>
+      </w:r>
+      <w:r>
+        <w:rPr>
+          <w:rFonts w:ascii="Arial" w:cs="Arial" w:eastAsia="Arial" w:hAnsi="Arial"/>
+          <w:sz w:val="24"/>
+          <w:szCs w:val="24"/>
+        </w:rPr>
+        <w:t xml:space="preserve">: DNS queries over HTTPS (DoH). [</w:t>
       </w:r>
       <w:r>
         <w:rPr>
@@ -9450,15 +10032,29 @@
           <w:sz w:val="24"/>
           <w:szCs w:val="24"/>
         </w:rPr>
-        <w:t xml:space="preserve">et al</w:t>
-      </w:r>
-      <w:r>
-        <w:rPr>
-          <w:rFonts w:ascii="Arial" w:cs="Arial" w:eastAsia="Arial" w:hAnsi="Arial"/>
-          <w:sz w:val="24"/>
-          <w:szCs w:val="24"/>
-        </w:rPr>
-        <w:t xml:space="preserve">. Comparing the effects of DNS, DoT, and DoH on web performance. </w:t>
+        <w:t xml:space="preserve">S. l.</w:t>
+      </w:r>
+      <w:r>
+        <w:rPr>
+          <w:rFonts w:ascii="Arial" w:cs="Arial" w:eastAsia="Arial" w:hAnsi="Arial"/>
+          <w:sz w:val="24"/>
+          <w:szCs w:val="24"/>
+        </w:rPr>
+        <w:t xml:space="preserve">]: IETF, 2018. DOI: https://doi.org/10.17487/RFC8484.</w:t>
+      </w:r>
+    </w:p>
+    <w:p>
+      <w:pPr>
+        <w:spacing w:after="240" w:line="240"/>
+        <w:jc w:val="left"/>
+      </w:pPr>
+      <w:r>
+        <w:rPr>
+          <w:rFonts w:ascii="Arial" w:cs="Arial" w:eastAsia="Arial" w:hAnsi="Arial"/>
+          <w:sz w:val="24"/>
+          <w:szCs w:val="24"/>
+        </w:rPr>
+        <w:t xml:space="preserve">HOUNSEL, Austin </w:t>
       </w:r>
       <w:r>
         <w:rPr>
@@ -9468,6 +10064,24 @@
           <w:sz w:val="24"/>
           <w:szCs w:val="24"/>
         </w:rPr>
+        <w:t xml:space="preserve">et al</w:t>
+      </w:r>
+      <w:r>
+        <w:rPr>
+          <w:rFonts w:ascii="Arial" w:cs="Arial" w:eastAsia="Arial" w:hAnsi="Arial"/>
+          <w:sz w:val="24"/>
+          <w:szCs w:val="24"/>
+        </w:rPr>
+        <w:t xml:space="preserve">. Comparing the effects of DNS, DoT, and DoH on web performance. </w:t>
+      </w:r>
+      <w:r>
+        <w:rPr>
+          <w:rFonts w:ascii="Arial" w:cs="Arial" w:eastAsia="Arial" w:hAnsi="Arial"/>
+          <w:i/>
+          <w:iCs/>
+          <w:sz w:val="24"/>
+          <w:szCs w:val="24"/>
+        </w:rPr>
         <w:t xml:space="preserve">In</w:t>
       </w:r>
       <w:r>
@@ -9576,7 +10190,25 @@
           <w:sz w:val="24"/>
           <w:szCs w:val="24"/>
         </w:rPr>
-        <w:t xml:space="preserve">KHORMALI, Aminollah </w:t>
+        <w:t xml:space="preserve">HUITEMA, Christian; DICKINSON, Sara; MANKIN, Allison. </w:t>
+      </w:r>
+      <w:r>
+        <w:rPr>
+          <w:rFonts w:ascii="Arial" w:cs="Arial" w:eastAsia="Arial" w:hAnsi="Arial"/>
+          <w:b/>
+          <w:bCs/>
+          <w:sz w:val="24"/>
+          <w:szCs w:val="24"/>
+        </w:rPr>
+        <w:t xml:space="preserve">RFC 9250</w:t>
+      </w:r>
+      <w:r>
+        <w:rPr>
+          <w:rFonts w:ascii="Arial" w:cs="Arial" w:eastAsia="Arial" w:hAnsi="Arial"/>
+          <w:sz w:val="24"/>
+          <w:szCs w:val="24"/>
+        </w:rPr>
+        <w:t xml:space="preserve">: DNS over dedicated QUIC connections. [</w:t>
       </w:r>
       <w:r>
         <w:rPr>
@@ -9586,33 +10218,29 @@
           <w:sz w:val="24"/>
           <w:szCs w:val="24"/>
         </w:rPr>
-        <w:t xml:space="preserve">et al</w:t>
-      </w:r>
-      <w:r>
-        <w:rPr>
-          <w:rFonts w:ascii="Arial" w:cs="Arial" w:eastAsia="Arial" w:hAnsi="Arial"/>
-          <w:sz w:val="24"/>
-          <w:szCs w:val="24"/>
-        </w:rPr>
-        <w:t xml:space="preserve">. Domain name system security and privacy: a contemporary survey. </w:t>
-      </w:r>
-      <w:r>
-        <w:rPr>
-          <w:rFonts w:ascii="Arial" w:cs="Arial" w:eastAsia="Arial" w:hAnsi="Arial"/>
-          <w:b/>
-          <w:bCs/>
-          <w:sz w:val="24"/>
-          <w:szCs w:val="24"/>
-        </w:rPr>
-        <w:t xml:space="preserve">arXiv</w:t>
-      </w:r>
-      <w:r>
-        <w:rPr>
-          <w:rFonts w:ascii="Arial" w:cs="Arial" w:eastAsia="Arial" w:hAnsi="Arial"/>
-          <w:sz w:val="24"/>
-          <w:szCs w:val="24"/>
-        </w:rPr>
-        <w:t xml:space="preserve">, [</w:t>
+        <w:t xml:space="preserve">S. l.</w:t>
+      </w:r>
+      <w:r>
+        <w:rPr>
+          <w:rFonts w:ascii="Arial" w:cs="Arial" w:eastAsia="Arial" w:hAnsi="Arial"/>
+          <w:sz w:val="24"/>
+          <w:szCs w:val="24"/>
+        </w:rPr>
+        <w:t xml:space="preserve">]: IETF, 2022. DOI: https://doi.org/10.17487/RFC9250.</w:t>
+      </w:r>
+    </w:p>
+    <w:p>
+      <w:pPr>
+        <w:spacing w:after="240" w:line="240"/>
+        <w:jc w:val="left"/>
+      </w:pPr>
+      <w:r>
+        <w:rPr>
+          <w:rFonts w:ascii="Arial" w:cs="Arial" w:eastAsia="Arial" w:hAnsi="Arial"/>
+          <w:sz w:val="24"/>
+          <w:szCs w:val="24"/>
+        </w:rPr>
+        <w:t xml:space="preserve">KHORMALI, Aminollah </w:t>
       </w:r>
       <w:r>
         <w:rPr>
@@ -9622,6 +10250,42 @@
           <w:sz w:val="24"/>
           <w:szCs w:val="24"/>
         </w:rPr>
+        <w:t xml:space="preserve">et al</w:t>
+      </w:r>
+      <w:r>
+        <w:rPr>
+          <w:rFonts w:ascii="Arial" w:cs="Arial" w:eastAsia="Arial" w:hAnsi="Arial"/>
+          <w:sz w:val="24"/>
+          <w:szCs w:val="24"/>
+        </w:rPr>
+        <w:t xml:space="preserve">. Domain name system security and privacy: a contemporary survey. </w:t>
+      </w:r>
+      <w:r>
+        <w:rPr>
+          <w:rFonts w:ascii="Arial" w:cs="Arial" w:eastAsia="Arial" w:hAnsi="Arial"/>
+          <w:b/>
+          <w:bCs/>
+          <w:sz w:val="24"/>
+          <w:szCs w:val="24"/>
+        </w:rPr>
+        <w:t xml:space="preserve">arXiv</w:t>
+      </w:r>
+      <w:r>
+        <w:rPr>
+          <w:rFonts w:ascii="Arial" w:cs="Arial" w:eastAsia="Arial" w:hAnsi="Arial"/>
+          <w:sz w:val="24"/>
+          <w:szCs w:val="24"/>
+        </w:rPr>
+        <w:t xml:space="preserve">, [</w:t>
+      </w:r>
+      <w:r>
+        <w:rPr>
+          <w:rFonts w:ascii="Arial" w:cs="Arial" w:eastAsia="Arial" w:hAnsi="Arial"/>
+          <w:i/>
+          <w:iCs/>
+          <w:sz w:val="24"/>
+          <w:szCs w:val="24"/>
+        </w:rPr>
         <w:t xml:space="preserve">s. l.</w:t>
       </w:r>
       <w:r>
@@ -9922,25 +10586,7 @@
           <w:sz w:val="24"/>
           <w:szCs w:val="24"/>
         </w:rPr>
-        <w:t xml:space="preserve">PI-HOLE. </w:t>
-      </w:r>
-      <w:r>
-        <w:rPr>
-          <w:rFonts w:ascii="Arial" w:cs="Arial" w:eastAsia="Arial" w:hAnsi="Arial"/>
-          <w:b/>
-          <w:bCs/>
-          <w:sz w:val="24"/>
-          <w:szCs w:val="24"/>
-        </w:rPr>
-        <w:t xml:space="preserve">Pi-hole documentation</w:t>
-      </w:r>
-      <w:r>
-        <w:rPr>
-          <w:rFonts w:ascii="Arial" w:cs="Arial" w:eastAsia="Arial" w:hAnsi="Arial"/>
-          <w:sz w:val="24"/>
-          <w:szCs w:val="24"/>
-        </w:rPr>
-        <w:t xml:space="preserve">. [</w:t>
+        <w:t xml:space="preserve">PEFFERS, Ken </w:t>
       </w:r>
       <w:r>
         <w:rPr>
@@ -9950,15 +10596,51 @@
           <w:sz w:val="24"/>
           <w:szCs w:val="24"/>
         </w:rPr>
-        <w:t xml:space="preserve">S. l.</w:t>
-      </w:r>
-      <w:r>
-        <w:rPr>
-          <w:rFonts w:ascii="Arial" w:cs="Arial" w:eastAsia="Arial" w:hAnsi="Arial"/>
-          <w:sz w:val="24"/>
-          <w:szCs w:val="24"/>
-        </w:rPr>
-        <w:t xml:space="preserve">]: Pi-hole, 2025a. Disponível em: https://docs.pi-hole.net/. Acesso em: 26 out. 2026.</w:t>
+        <w:t xml:space="preserve">et al</w:t>
+      </w:r>
+      <w:r>
+        <w:rPr>
+          <w:rFonts w:ascii="Arial" w:cs="Arial" w:eastAsia="Arial" w:hAnsi="Arial"/>
+          <w:sz w:val="24"/>
+          <w:szCs w:val="24"/>
+        </w:rPr>
+        <w:t xml:space="preserve">. A design science research methodology for information systems research. </w:t>
+      </w:r>
+      <w:r>
+        <w:rPr>
+          <w:rFonts w:ascii="Arial" w:cs="Arial" w:eastAsia="Arial" w:hAnsi="Arial"/>
+          <w:b/>
+          <w:bCs/>
+          <w:sz w:val="24"/>
+          <w:szCs w:val="24"/>
+        </w:rPr>
+        <w:t xml:space="preserve">Journal of Management Information Systems</w:t>
+      </w:r>
+      <w:r>
+        <w:rPr>
+          <w:rFonts w:ascii="Arial" w:cs="Arial" w:eastAsia="Arial" w:hAnsi="Arial"/>
+          <w:sz w:val="24"/>
+          <w:szCs w:val="24"/>
+        </w:rPr>
+        <w:t xml:space="preserve">, [</w:t>
+      </w:r>
+      <w:r>
+        <w:rPr>
+          <w:rFonts w:ascii="Arial" w:cs="Arial" w:eastAsia="Arial" w:hAnsi="Arial"/>
+          <w:i/>
+          <w:iCs/>
+          <w:sz w:val="24"/>
+          <w:szCs w:val="24"/>
+        </w:rPr>
+        <w:t xml:space="preserve">s. l.</w:t>
+      </w:r>
+      <w:r>
+        <w:rPr>
+          <w:rFonts w:ascii="Arial" w:cs="Arial" w:eastAsia="Arial" w:hAnsi="Arial"/>
+          <w:sz w:val="24"/>
+          <w:szCs w:val="24"/>
+        </w:rPr>
+        <w:t xml:space="preserve">], v. 24, n. 3, p. 45-77, 2007. DOI: https://doi.org/10.2753/MIS0742-1222240302.</w:t>
       </w:r>
     </w:p>
     <w:p>
@@ -9982,7 +10664,7 @@
           <w:sz w:val="24"/>
           <w:szCs w:val="24"/>
         </w:rPr>
-        <w:t xml:space="preserve">Introducing Pi-hole v6</w:t>
+        <w:t xml:space="preserve">Pi-hole documentation</w:t>
       </w:r>
       <w:r>
         <w:rPr>
@@ -10008,7 +10690,7 @@
           <w:sz w:val="24"/>
           <w:szCs w:val="24"/>
         </w:rPr>
-        <w:t xml:space="preserve">]: Pi-hole, 18 fev. 2025b. Disponível em: https://pi-hole.net/blog/2025/02/18/introducing-pi-hole-v6/. Acesso em: 26 out. 2026.</w:t>
+        <w:t xml:space="preserve">]: Pi-hole, 2025a. Disponível em: https://docs.pi-hole.net/. Acesso em: 26 out. 2026.</w:t>
       </w:r>
     </w:p>
     <w:p>
@@ -10022,25 +10704,43 @@
           <w:sz w:val="24"/>
           <w:szCs w:val="24"/>
         </w:rPr>
-        <w:t xml:space="preserve">ROSE, Scott; LIU, Cricket; GIBSON, Ross. </w:t>
-      </w:r>
-      <w:r>
-        <w:rPr>
-          <w:rFonts w:ascii="Arial" w:cs="Arial" w:eastAsia="Arial" w:hAnsi="Arial"/>
-          <w:b/>
-          <w:bCs/>
-          <w:sz w:val="24"/>
-          <w:szCs w:val="24"/>
-        </w:rPr>
-        <w:t xml:space="preserve">Secure Domain Name System (DNS) deployment guide</w:t>
-      </w:r>
-      <w:r>
-        <w:rPr>
-          <w:rFonts w:ascii="Arial" w:cs="Arial" w:eastAsia="Arial" w:hAnsi="Arial"/>
-          <w:sz w:val="24"/>
-          <w:szCs w:val="24"/>
-        </w:rPr>
-        <w:t xml:space="preserve">. Gaithersburg, MD: NIST, 2026. (NIST Special Publication 800-81r3). DOI: https://doi.org/10.6028/NIST.SP.800-81r3.</w:t>
+        <w:t xml:space="preserve">PI-HOLE. </w:t>
+      </w:r>
+      <w:r>
+        <w:rPr>
+          <w:rFonts w:ascii="Arial" w:cs="Arial" w:eastAsia="Arial" w:hAnsi="Arial"/>
+          <w:b/>
+          <w:bCs/>
+          <w:sz w:val="24"/>
+          <w:szCs w:val="24"/>
+        </w:rPr>
+        <w:t xml:space="preserve">Introducing Pi-hole v6</w:t>
+      </w:r>
+      <w:r>
+        <w:rPr>
+          <w:rFonts w:ascii="Arial" w:cs="Arial" w:eastAsia="Arial" w:hAnsi="Arial"/>
+          <w:sz w:val="24"/>
+          <w:szCs w:val="24"/>
+        </w:rPr>
+        <w:t xml:space="preserve">. [</w:t>
+      </w:r>
+      <w:r>
+        <w:rPr>
+          <w:rFonts w:ascii="Arial" w:cs="Arial" w:eastAsia="Arial" w:hAnsi="Arial"/>
+          <w:i/>
+          <w:iCs/>
+          <w:sz w:val="24"/>
+          <w:szCs w:val="24"/>
+        </w:rPr>
+        <w:t xml:space="preserve">S. l.</w:t>
+      </w:r>
+      <w:r>
+        <w:rPr>
+          <w:rFonts w:ascii="Arial" w:cs="Arial" w:eastAsia="Arial" w:hAnsi="Arial"/>
+          <w:sz w:val="24"/>
+          <w:szCs w:val="24"/>
+        </w:rPr>
+        <w:t xml:space="preserve">]: Pi-hole, 18 fev. 2025b. Disponível em: https://pi-hole.net/blog/2025/02/18/introducing-pi-hole-v6/. Acesso em: 26 out. 2026.</w:t>
       </w:r>
     </w:p>
     <w:p>
@@ -10054,25 +10754,25 @@
           <w:sz w:val="24"/>
           <w:szCs w:val="24"/>
         </w:rPr>
-        <w:t xml:space="preserve">STALLINGS, William; BROWN, Lawrie. </w:t>
-      </w:r>
-      <w:r>
-        <w:rPr>
-          <w:rFonts w:ascii="Arial" w:cs="Arial" w:eastAsia="Arial" w:hAnsi="Arial"/>
-          <w:b/>
-          <w:bCs/>
-          <w:sz w:val="24"/>
-          <w:szCs w:val="24"/>
-        </w:rPr>
-        <w:t xml:space="preserve">Segurança de computadores</w:t>
-      </w:r>
-      <w:r>
-        <w:rPr>
-          <w:rFonts w:ascii="Arial" w:cs="Arial" w:eastAsia="Arial" w:hAnsi="Arial"/>
-          <w:sz w:val="24"/>
-          <w:szCs w:val="24"/>
-        </w:rPr>
-        <w:t xml:space="preserve">: princípios e práticas. 2. ed. Rio de Janeiro: Elsevier, 2014.</w:t>
+        <w:t xml:space="preserve">ROSE, Scott; LIU, Cricket; GIBSON, Ross. </w:t>
+      </w:r>
+      <w:r>
+        <w:rPr>
+          <w:rFonts w:ascii="Arial" w:cs="Arial" w:eastAsia="Arial" w:hAnsi="Arial"/>
+          <w:b/>
+          <w:bCs/>
+          <w:sz w:val="24"/>
+          <w:szCs w:val="24"/>
+        </w:rPr>
+        <w:t xml:space="preserve">Secure Domain Name System (DNS) deployment guide</w:t>
+      </w:r>
+      <w:r>
+        <w:rPr>
+          <w:rFonts w:ascii="Arial" w:cs="Arial" w:eastAsia="Arial" w:hAnsi="Arial"/>
+          <w:sz w:val="24"/>
+          <w:szCs w:val="24"/>
+        </w:rPr>
+        <w:t xml:space="preserve">. Gaithersburg, MD: NIST, 2026. (NIST Special Publication 800-81r3). DOI: https://doi.org/10.6028/NIST.SP.800-81r3.</w:t>
       </w:r>
     </w:p>
     <w:p>
@@ -10086,25 +10786,25 @@
           <w:sz w:val="24"/>
           <w:szCs w:val="24"/>
         </w:rPr>
-        <w:t xml:space="preserve">TANENBAUM, Andrew S.; FEAMSTER, Nick; WETHERALL, David J. </w:t>
-      </w:r>
-      <w:r>
-        <w:rPr>
-          <w:rFonts w:ascii="Arial" w:cs="Arial" w:eastAsia="Arial" w:hAnsi="Arial"/>
-          <w:b/>
-          <w:bCs/>
-          <w:sz w:val="24"/>
-          <w:szCs w:val="24"/>
-        </w:rPr>
-        <w:t xml:space="preserve">Redes de computadores</w:t>
-      </w:r>
-      <w:r>
-        <w:rPr>
-          <w:rFonts w:ascii="Arial" w:cs="Arial" w:eastAsia="Arial" w:hAnsi="Arial"/>
-          <w:sz w:val="24"/>
-          <w:szCs w:val="24"/>
-        </w:rPr>
-        <w:t xml:space="preserve">. 6. ed. Porto Alegre: Bookman, 2021.</w:t>
+        <w:t xml:space="preserve">STALLINGS, William; BROWN, Lawrie. </w:t>
+      </w:r>
+      <w:r>
+        <w:rPr>
+          <w:rFonts w:ascii="Arial" w:cs="Arial" w:eastAsia="Arial" w:hAnsi="Arial"/>
+          <w:b/>
+          <w:bCs/>
+          <w:sz w:val="24"/>
+          <w:szCs w:val="24"/>
+        </w:rPr>
+        <w:t xml:space="preserve">Segurança de computadores</w:t>
+      </w:r>
+      <w:r>
+        <w:rPr>
+          <w:rFonts w:ascii="Arial" w:cs="Arial" w:eastAsia="Arial" w:hAnsi="Arial"/>
+          <w:sz w:val="24"/>
+          <w:szCs w:val="24"/>
+        </w:rPr>
+        <w:t xml:space="preserve">: princípios e práticas. 2. ed. Rio de Janeiro: Elsevier, 2014.</w:t>
       </w:r>
     </w:p>
     <w:p>
@@ -10118,6 +10818,38 @@
           <w:sz w:val="24"/>
           <w:szCs w:val="24"/>
         </w:rPr>
+        <w:t xml:space="preserve">TANENBAUM, Andrew S.; FEAMSTER, Nick; WETHERALL, David J. </w:t>
+      </w:r>
+      <w:r>
+        <w:rPr>
+          <w:rFonts w:ascii="Arial" w:cs="Arial" w:eastAsia="Arial" w:hAnsi="Arial"/>
+          <w:b/>
+          <w:bCs/>
+          <w:sz w:val="24"/>
+          <w:szCs w:val="24"/>
+        </w:rPr>
+        <w:t xml:space="preserve">Redes de computadores</w:t>
+      </w:r>
+      <w:r>
+        <w:rPr>
+          <w:rFonts w:ascii="Arial" w:cs="Arial" w:eastAsia="Arial" w:hAnsi="Arial"/>
+          <w:sz w:val="24"/>
+          <w:szCs w:val="24"/>
+        </w:rPr>
+        <w:t xml:space="preserve">. 6. ed. Porto Alegre: Bookman, 2021.</w:t>
+      </w:r>
+    </w:p>
+    <w:p>
+      <w:pPr>
+        <w:spacing w:after="240" w:line="240"/>
+        <w:jc w:val="left"/>
+      </w:pPr>
+      <w:r>
+        <w:rPr>
+          <w:rFonts w:ascii="Arial" w:cs="Arial" w:eastAsia="Arial" w:hAnsi="Arial"/>
+          <w:sz w:val="24"/>
+          <w:szCs w:val="24"/>
+        </w:rPr>
         <w:t xml:space="preserve">UNIVERSITÉ TOULOUSE CAPITOLE. </w:t>
       </w:r>
       <w:r>
@@ -10137,6 +10869,56 @@
           <w:szCs w:val="24"/>
         </w:rPr>
         <w:t xml:space="preserve">. Toulouse: Université Toulouse Capitole, 2025. Disponível em: https://dsi.ut-capitole.fr/blacklists/. Acesso em: 26 out. 2026.</w:t>
+      </w:r>
+    </w:p>
+    <w:p>
+      <w:pPr>
+        <w:spacing w:after="240" w:line="240"/>
+        <w:jc w:val="left"/>
+      </w:pPr>
+      <w:r>
+        <w:rPr>
+          <w:rFonts w:ascii="Arial" w:cs="Arial" w:eastAsia="Arial" w:hAnsi="Arial"/>
+          <w:sz w:val="24"/>
+          <w:szCs w:val="24"/>
+        </w:rPr>
+        <w:t xml:space="preserve">VENABLE, John; PRIES-HEJE, Jan; BASKERVILLE, Richard. FEDS: a framework for evaluation in design science research. </w:t>
+      </w:r>
+      <w:r>
+        <w:rPr>
+          <w:rFonts w:ascii="Arial" w:cs="Arial" w:eastAsia="Arial" w:hAnsi="Arial"/>
+          <w:b/>
+          <w:bCs/>
+          <w:sz w:val="24"/>
+          <w:szCs w:val="24"/>
+        </w:rPr>
+        <w:t xml:space="preserve">European Journal of Information Systems</w:t>
+      </w:r>
+      <w:r>
+        <w:rPr>
+          <w:rFonts w:ascii="Arial" w:cs="Arial" w:eastAsia="Arial" w:hAnsi="Arial"/>
+          <w:sz w:val="24"/>
+          <w:szCs w:val="24"/>
+        </w:rPr>
+        <w:t xml:space="preserve">, [</w:t>
+      </w:r>
+      <w:r>
+        <w:rPr>
+          <w:rFonts w:ascii="Arial" w:cs="Arial" w:eastAsia="Arial" w:hAnsi="Arial"/>
+          <w:i/>
+          <w:iCs/>
+          <w:sz w:val="24"/>
+          <w:szCs w:val="24"/>
+        </w:rPr>
+        <w:t xml:space="preserve">s. l.</w:t>
+      </w:r>
+      <w:r>
+        <w:rPr>
+          <w:rFonts w:ascii="Arial" w:cs="Arial" w:eastAsia="Arial" w:hAnsi="Arial"/>
+          <w:sz w:val="24"/>
+          <w:szCs w:val="24"/>
+        </w:rPr>
+        <w:t xml:space="preserve">], v. 25, n. 1, p. 77-89, 2016. DOI: https://doi.org/10.1057/ejis.2014.36.</w:t>
       </w:r>
     </w:p>
     <w:p>
@@ -11546,7 +12328,7 @@
           <w:sz w:val="20"/>
           <w:szCs w:val="20"/>
         </w:rPr>
-        <w:t xml:space="preserve">Fonte: Elaborado pelo autor (2026).</w:t>
+        <w:t xml:space="preserve">Fonte: Elaborado pelos autores (2026).</w:t>
       </w:r>
     </w:p>
     <w:sectPr>

</xml_diff>

<commit_message>
Define instalação nativa do Pi-hole, acesso restrito ao painel e limite sobre Docker
Co-Authored-By: Claude Sonnet 5.5 <noreply@anthropic.com>
</commit_message>
<xml_diff>
--- a/Orientação – Projeto de Pesquisa/Projeto de Pesquisa - Paulo Ricardo.docx
+++ b/Orientação – Projeto de Pesquisa/Projeto de Pesquisa - Paulo Ricardo.docx
@@ -1800,7 +1800,7 @@
           <w:sz w:val="24"/>
           <w:szCs w:val="24"/>
         </w:rPr>
-        <w:t xml:space="preserve">) da rede local e que responde com um endereço nulo às consultas por domínios presentes em listas de bloqueio, impedindo que qualquer dispositivo da rede alcance esses destinos, sem necessidade de instalar programas nas estações de trabalho (PI-HOLE, 2025a). Embora seja popularmente associado ao Raspberry Pi, o Pi-hole pode ser instalado em qualquer servidor Linux, inclusive em um computador reaproveitado ou em uma máquina virtual, solução adotada neste projeto por oferecer maior capacidade de processamento, armazenamento e estabilidade para um ambiente institucional.</w:t>
+        <w:t xml:space="preserve">) da rede local e que responde com um endereço nulo às consultas por domínios presentes em listas de bloqueio, impedindo que qualquer dispositivo da rede alcance esses destinos, sem necessidade de instalar programas nas estações de trabalho (PI-HOLE, 2025a). Embora seja popularmente associado ao Raspberry Pi, o Pi-hole pode ser instalado em qualquer servidor Linux, inclusive em um computador reaproveitado, solução adotada neste projeto, com instalação nativa e sem contêineres, e em uma máquina virtual, restrita ao ambiente de homologação, por oferecer maior capacidade de processamento, armazenamento e estabilidade para um ambiente institucional.</w:t>
       </w:r>
     </w:p>
     <w:p>
@@ -3131,7 +3131,7 @@
           <w:sz w:val="24"/>
           <w:szCs w:val="24"/>
         </w:rPr>
-        <w:t xml:space="preserve"> e API REST ao próprio FTL, eliminando dependências como lighttpd e PHP, unificou a configuração em um único arquivo e passou a oferecer suporte nativo a HTTPS e a listas de permissão por assinatura (PI-HOLE, 2025b). Como o filtro atua no servidor, todos os dispositivos que usam o Pi-hole como DNS ficam protegidos sem instalação de </w:t>
+        <w:t xml:space="preserve"> e API REST ao próprio FTL, eliminando dependências como lighttpd e PHP, unificou a configuração em um único arquivo e passou a oferecer suporte nativo a HTTPS e a listas de permissão por assinatura (PI-HOLE, 2025b). O Pi-hole também é distribuído como imagem Docker, forma que não será avaliada neste trabalho. Como o filtro atua no servidor, todos os dispositivos que usam o Pi-hole como DNS ficam protegidos sem instalação de </w:t>
       </w:r>
       <w:r>
         <w:rPr>
@@ -4876,7 +4876,25 @@
           <w:sz w:val="24"/>
           <w:szCs w:val="24"/>
         </w:rPr>
-        <w:t xml:space="preserve">Na etapa 3, o servidor local receberá um sistema operacional Linux de suporte estendido (Debian 12 ou Ubuntu Server 24.04 LTS), endereço IP fixo e a versão estável mais recente do Pi-hole. Serão configuradas listas de bloqueio por categoria, a partir das fontes discutidas na seção 3.3, uma lista local de domínios indesejados, definida com o responsável pelo setor e aplicada apenas ao grupo de clientes desse setor, uma lista de permissão com domínios de sistemas utilizados pelo órgão e, ao menos, dois grupos de clientes com políticas distintas. No roteador ou </w:t>
+        <w:t xml:space="preserve">Na etapa 3, o servidor local receberá um sistema operacional Linux de suporte estendido (Debian 12 ou Ubuntu Server 24.04 LTS), sem interface gráfica, instalado em computador reaproveitado, endereço IP fixo e a versão estável mais recente do Pi-hole, instalada diretamente no sistema, sem contêineres, pela simplicidade da configuração de rede e pela facilidade de replicação por equipes pequenas. O acesso ao painel de administração será restrito, por regra de </w:t>
+      </w:r>
+      <w:r>
+        <w:rPr>
+          <w:rFonts w:ascii="Arial" w:cs="Arial" w:eastAsia="Arial" w:hAnsi="Arial"/>
+          <w:i/>
+          <w:iCs/>
+          <w:sz w:val="24"/>
+          <w:szCs w:val="24"/>
+        </w:rPr>
+        <w:t xml:space="preserve">firewall</w:t>
+      </w:r>
+      <w:r>
+        <w:rPr>
+          <w:rFonts w:ascii="Arial" w:cs="Arial" w:eastAsia="Arial" w:hAnsi="Arial"/>
+          <w:sz w:val="24"/>
+          <w:szCs w:val="24"/>
+        </w:rPr>
+        <w:t xml:space="preserve"> do servidor, às estações da administração, com senha forte e HTTPS. O computador será configurado para reiniciar após queda de energia e terá cópia periódica de suas configurações. Serão configuradas listas de bloqueio por categoria, a partir das fontes discutidas na seção 3.3, uma lista local de domínios indesejados, definida com o responsável pelo setor e aplicada apenas ao grupo de clientes desse setor, uma lista de permissão com domínios de sistemas utilizados pelo órgão e, ao menos, dois grupos de clientes com políticas distintas. No roteador ou </w:t>
       </w:r>
       <w:r>
         <w:rPr>
@@ -6002,7 +6020,7 @@
                 <w:sz w:val="20"/>
                 <w:szCs w:val="20"/>
               </w:rPr>
-              <w:t xml:space="preserve"> incorreta, registrando o comportamento da rede e a recuperação</w:t>
+              <w:t xml:space="preserve"> incorreta, o desligamento abrupto do computador e a restauração da cópia de configuração, registrando o comportamento da rede e a recuperação, e verificar que o painel não abre em estação comum</w:t>
             </w:r>
           </w:p>
         </w:tc>
@@ -6471,7 +6489,7 @@
           <w:sz w:val="24"/>
           <w:szCs w:val="24"/>
         </w:rPr>
-        <w:t xml:space="preserve">a) servidor local: computador ou máquina virtual com Linux, endereço IP fixo, Pi-hole e, opcionalmente, Unbound como resolvedor recursivo;</w:t>
+        <w:t xml:space="preserve">a) servidor local: computador reaproveitado com Linux em edição servidor, endereço IP fixo, Pi-hole instalado de forma nativa e, opcionalmente, Unbound como resolvedor recursivo;</w:t>
       </w:r>
     </w:p>
     <w:p>
@@ -6534,7 +6552,7 @@
           <w:sz w:val="24"/>
           <w:szCs w:val="24"/>
         </w:rPr>
-        <w:t xml:space="preserve">d) gestão e governança: painel de acompanhamento, nível de privacidade definido, retenção limitada de registros, </w:t>
+        <w:t xml:space="preserve">d) gestão e governança: painel de acompanhamento com acesso restrito às estações de administração, nível de privacidade definido, retenção limitada de registros, </w:t>
       </w:r>
       <w:r>
         <w:rPr>

</xml_diff>